<commit_message>
feat: add portal data and dashboard idle to portfolio
</commit_message>
<xml_diff>
--- a/dokumenrio/CV_ATS_Rio_Darma_Fredika.docx
+++ b/dokumenrio/CV_ATS_Rio_Darma_Fredika.docx
@@ -1,13 +1,19 @@
 
 <file path=word/document.xml><?xml version="1.0" encoding="utf-8"?>
-<w:document xmlns:wpc="http://schemas.microsoft.com/office/word/2010/wordprocessingCanvas" xmlns:mo="http://schemas.microsoft.com/office/mac/office/2008/main" xmlns:mc="http://schemas.openxmlformats.org/markup-compatibility/2006" xmlns:mv="urn:schemas-microsoft-com:mac:vml" xmlns:o="urn:schemas-microsoft-com:office:office" xmlns:r="http://schemas.openxmlformats.org/officeDocument/2006/relationships" xmlns:m="http://schemas.openxmlformats.org/officeDocument/2006/math" xmlns:v="urn:schemas-microsoft-com:vml" xmlns:wp14="http://schemas.microsoft.com/office/word/2010/wordprocessingDrawing" xmlns:wp="http://schemas.openxmlformats.org/drawingml/2006/wordprocessingDrawing" xmlns:w10="urn:schemas-microsoft-com:office:word" xmlns:w="http://schemas.openxmlformats.org/wordprocessingml/2006/main" xmlns:w14="http://schemas.microsoft.com/office/word/2010/wordml" xmlns:wpg="http://schemas.microsoft.com/office/word/2010/wordprocessingGroup" xmlns:wpi="http://schemas.microsoft.com/office/word/2010/wordprocessingInk" xmlns:wne="http://schemas.microsoft.com/office/word/2006/wordml" xmlns:wps="http://schemas.microsoft.com/office/word/2010/wordprocessingShape" mc:Ignorable="w14 wp14">
+<w:document xmlns:wpc="http://schemas.microsoft.com/office/word/2010/wordprocessingCanvas" xmlns:mc="http://schemas.openxmlformats.org/markup-compatibility/2006" xmlns:o="urn:schemas-microsoft-com:office:office" xmlns:r="http://schemas.openxmlformats.org/officeDocument/2006/relationships" xmlns:m="http://schemas.openxmlformats.org/officeDocument/2006/math" xmlns:v="urn:schemas-microsoft-com:vml" xmlns:wp14="http://schemas.microsoft.com/office/word/2010/wordprocessingDrawing" xmlns:wp="http://schemas.openxmlformats.org/drawingml/2006/wordprocessingDrawing" xmlns:w10="urn:schemas-microsoft-com:office:word" xmlns:w="http://schemas.openxmlformats.org/wordprocessingml/2006/main" xmlns:w14="http://schemas.microsoft.com/office/word/2010/wordml" xmlns:w15="http://schemas.microsoft.com/office/word/2012/wordml" xmlns:w16se="http://schemas.microsoft.com/office/word/2015/wordml/symex" xmlns:w16cid="http://schemas.microsoft.com/office/word/2016/wordml/cid" xmlns:w16="http://schemas.microsoft.com/office/word/2018/wordml" xmlns:w16cex="http://schemas.microsoft.com/office/word/2018/wordml/cex" xmlns:w16sdtdh="http://schemas.microsoft.com/office/word/2020/wordml/sdtdatahash" xmlns:wne="http://schemas.microsoft.com/office/word/2006/wordml" xmlns:wpg="http://schemas.microsoft.com/office/word/2010/wordprocessingGroup" xmlns:wps="http://schemas.microsoft.com/office/word/2010/wordprocessingShape" mc:Ignorable="w14 w15 w16se w16cid w16 w16cex w16sdtdh wp14">
   <w:body>
     <w:tbl>
       <w:tblPr>
-        <w:tblW w:type="auto" w:w="0"/>
+        <w:tblW w:w="0" w:type="auto"/>
         <w:jc w:val="center"/>
         <w:tblLayout w:type="fixed"/>
-        <w:tblLook w:firstColumn="1" w:firstRow="1" w:lastColumn="0" w:lastRow="0" w:noHBand="0" w:noVBand="1" w:val="04A0"/>
+        <w:tblCellMar>
+          <w:top w:w="0" w:type="dxa"/>
+          <w:left w:w="108" w:type="dxa"/>
+          <w:bottom w:w="0" w:type="dxa"/>
+          <w:right w:w="108" w:type="dxa"/>
+        </w:tblCellMar>
+        <w:tblLook w:firstRow="1" w:firstColumn="1" w:noVBand="1"/>
       </w:tblPr>
       <w:tblGrid>
         <w:gridCol w:w="5400"/>
@@ -16,71 +22,87 @@
       <w:tr>
         <w:tc>
           <w:tcPr>
-            <w:tcW w:type="dxa" w:w="8928"/>
+            <w:tcW w:w="8928" w:type="dxa"/>
             <w:tcMar>
               <w:top w:w="0" w:type="dxa"/>
+              <w:left w:w="0" w:type="dxa"/>
               <w:bottom w:w="0" w:type="dxa"/>
-              <w:left w:w="0" w:type="dxa"/>
               <w:right w:w="50" w:type="dxa"/>
             </w:tcMar>
           </w:tcPr>
           <w:p>
             <w:pPr>
-              <w:spacing w:after="40" w:before="0"/>
+              <w:spacing w:before="0" w:after="40"/>
             </w:pPr>
             <w:r>
               <w:rPr>
-                <w:rFonts w:ascii="Calibri" w:hAnsi="Calibri"/>
+                <w:rFonts w:ascii="Calibri" w:hAnsi="Calibri" w:eastAsia="ＭＳ 明朝" w:cs="Calibri" w:eastAsiaTheme="minorEastAsia" w:csTheme="minorBidi"/>
                 <w:b/>
+                <w:bCs/>
                 <w:color w:val="0F172A"/>
                 <w:sz w:val="38"/>
+                <w:szCs w:val="22"/>
               </w:rPr>
               <w:t>RIO DARMA FREDIKA, S.Kom.</w:t>
             </w:r>
           </w:p>
           <w:p>
             <w:pPr>
-              <w:spacing w:after="80" w:before="0"/>
+              <w:spacing w:before="0" w:after="80"/>
             </w:pPr>
             <w:r>
               <w:rPr>
-                <w:rFonts w:ascii="Calibri" w:hAnsi="Calibri"/>
+                <w:rFonts w:ascii="Calibri" w:hAnsi="Calibri" w:eastAsia="ＭＳ 明朝" w:cs="Calibri" w:eastAsiaTheme="minorEastAsia" w:csTheme="minorBidi"/>
                 <w:b/>
+                <w:bCs/>
                 <w:color w:val="0284C7"/>
                 <w:sz w:val="20"/>
+                <w:szCs w:val="22"/>
               </w:rPr>
               <w:t>SOFTWARE &amp; DATA ENGINEER | PENGAWAS OPERASIONAL PERTAMA (POP BNSP)</w:t>
             </w:r>
           </w:p>
           <w:p>
             <w:pPr>
-              <w:spacing w:after="0" w:before="0" w:line="276" w:lineRule="auto"/>
+              <w:spacing w:before="0" w:after="0" w:line="276" w:lineRule="auto"/>
             </w:pPr>
             <w:r>
               <w:rPr>
-                <w:rFonts w:ascii="Calibri" w:hAnsi="Calibri"/>
+                <w:rFonts w:ascii="Calibri" w:hAnsi="Calibri" w:eastAsia="ＭＳ 明朝" w:cs="Calibri" w:eastAsiaTheme="minorEastAsia" w:csTheme="minorBidi"/>
                 <w:b/>
+                <w:bCs/>
                 <w:color w:val="475569"/>
                 <w:sz w:val="17"/>
+                <w:szCs w:val="22"/>
               </w:rPr>
               <w:t xml:space="preserve">Lokasi: </w:t>
             </w:r>
             <w:r>
+              <w:rPr>
+                <w:rFonts w:ascii="Cambria" w:hAnsi="Cambria" w:eastAsia="ＭＳ 明朝" w:cs="Cambria" w:asciiTheme="minorHAnsi" w:hAnsiTheme="minorHAnsi" w:eastAsiaTheme="minorEastAsia" w:csTheme="minorBidi"/>
+                <w:sz w:val="22"/>
+                <w:szCs w:val="22"/>
+              </w:rPr>
               <w:t xml:space="preserve">Garut, Jawa Barat, Indonesia  |  </w:t>
             </w:r>
             <w:r>
               <w:rPr>
-                <w:rFonts w:ascii="Calibri" w:hAnsi="Calibri"/>
+                <w:rFonts w:ascii="Calibri" w:hAnsi="Calibri" w:eastAsia="ＭＳ 明朝" w:cs="Calibri" w:eastAsiaTheme="minorEastAsia" w:csTheme="minorBidi"/>
                 <w:b/>
+                <w:bCs/>
                 <w:color w:val="475569"/>
                 <w:sz w:val="17"/>
+                <w:szCs w:val="22"/>
               </w:rPr>
               <w:t xml:space="preserve">Email: </w:t>
             </w:r>
             <w:hyperlink r:id="rId9">
               <w:r>
                 <w:rPr>
+                  <w:rFonts w:ascii="Cambria" w:hAnsi="Cambria" w:eastAsia="ＭＳ 明朝" w:cs="Cambria" w:asciiTheme="minorHAnsi" w:hAnsiTheme="minorHAnsi" w:eastAsiaTheme="minorEastAsia" w:csTheme="minorBidi"/>
                   <w:color w:val="0284C7"/>
+                  <w:sz w:val="22"/>
+                  <w:szCs w:val="22"/>
                   <w:u w:val="single"/>
                 </w:rPr>
                 <w:t>riodarma789@gmail.com</w:t>
@@ -89,38 +111,50 @@
           </w:p>
           <w:p>
             <w:pPr>
-              <w:spacing w:after="0" w:before="0" w:line="276" w:lineRule="auto"/>
+              <w:spacing w:before="0" w:after="0" w:line="276" w:lineRule="auto"/>
             </w:pPr>
             <w:r>
               <w:rPr>
-                <w:rFonts w:ascii="Calibri" w:hAnsi="Calibri"/>
+                <w:rFonts w:ascii="Calibri" w:hAnsi="Calibri" w:eastAsia="ＭＳ 明朝" w:cs="Calibri" w:eastAsiaTheme="minorEastAsia" w:csTheme="minorBidi"/>
                 <w:b/>
+                <w:bCs/>
                 <w:color w:val="475569"/>
                 <w:sz w:val="17"/>
+                <w:szCs w:val="22"/>
               </w:rPr>
               <w:t xml:space="preserve">Telepon / WhatsApp: </w:t>
             </w:r>
             <w:r>
-              <w:t>+62 812-1423-6050  /  +62 821-1669-8032</w:t>
+              <w:rPr>
+                <w:rFonts w:ascii="Cambria" w:hAnsi="Cambria" w:eastAsia="ＭＳ 明朝" w:cs="Cambria" w:asciiTheme="minorHAnsi" w:hAnsiTheme="minorHAnsi" w:eastAsiaTheme="minorEastAsia" w:csTheme="minorBidi"/>
+                <w:sz w:val="22"/>
+                <w:szCs w:val="22"/>
+              </w:rPr>
+              <w:t xml:space="preserve">+62 812-1423-6050  /  +62 821-1669-8032</w:t>
             </w:r>
           </w:p>
           <w:p>
             <w:pPr>
-              <w:spacing w:after="0" w:before="0" w:line="276" w:lineRule="auto"/>
+              <w:spacing w:before="0" w:after="0" w:line="276" w:lineRule="auto"/>
             </w:pPr>
             <w:r>
               <w:rPr>
-                <w:rFonts w:ascii="Calibri" w:hAnsi="Calibri"/>
+                <w:rFonts w:ascii="Calibri" w:hAnsi="Calibri" w:eastAsia="ＭＳ 明朝" w:cs="Calibri" w:eastAsiaTheme="minorEastAsia" w:csTheme="minorBidi"/>
                 <w:b/>
+                <w:bCs/>
                 <w:color w:val="475569"/>
                 <w:sz w:val="17"/>
+                <w:szCs w:val="22"/>
               </w:rPr>
               <w:t xml:space="preserve">Website Portofolio: </w:t>
             </w:r>
             <w:hyperlink r:id="rId10">
               <w:r>
                 <w:rPr>
+                  <w:rFonts w:ascii="Cambria" w:hAnsi="Cambria" w:eastAsia="ＭＳ 明朝" w:cs="Cambria" w:asciiTheme="minorHAnsi" w:hAnsiTheme="minorHAnsi" w:eastAsiaTheme="minorEastAsia" w:csTheme="minorBidi"/>
                   <w:color w:val="0284C7"/>
+                  <w:sz w:val="22"/>
+                  <w:szCs w:val="22"/>
                   <w:u w:val="single"/>
                 </w:rPr>
                 <w:t>https://riodarma002.github.io/web_porto_rio_darma/</w:t>
@@ -129,63 +163,88 @@
           </w:p>
           <w:p>
             <w:pPr>
-              <w:spacing w:after="0" w:before="0" w:line="276" w:lineRule="auto"/>
+              <w:spacing w:before="0" w:after="0" w:line="276" w:lineRule="auto"/>
             </w:pPr>
             <w:r>
               <w:rPr>
-                <w:rFonts w:ascii="Calibri" w:hAnsi="Calibri"/>
+                <w:rFonts w:ascii="Calibri" w:hAnsi="Calibri" w:eastAsia="ＭＳ 明朝" w:cs="Calibri" w:eastAsiaTheme="minorEastAsia" w:csTheme="minorBidi"/>
                 <w:b/>
+                <w:bCs/>
                 <w:color w:val="475569"/>
                 <w:sz w:val="17"/>
+                <w:szCs w:val="22"/>
               </w:rPr>
               <w:t xml:space="preserve">LinkedIn: </w:t>
             </w:r>
             <w:hyperlink r:id="rId11">
               <w:r>
                 <w:rPr>
+                  <w:rFonts w:ascii="Cambria" w:hAnsi="Cambria" w:eastAsia="ＭＳ 明朝" w:cs="Cambria" w:asciiTheme="minorHAnsi" w:hAnsiTheme="minorHAnsi" w:eastAsiaTheme="minorEastAsia" w:csTheme="minorBidi"/>
                   <w:color w:val="0284C7"/>
+                  <w:sz w:val="22"/>
+                  <w:szCs w:val="22"/>
                   <w:u w:val="single"/>
                 </w:rPr>
                 <w:t>linkedin.com/in/rio-darma-fredika-296b4277</w:t>
               </w:r>
             </w:hyperlink>
             <w:r>
+              <w:rPr>
+                <w:rFonts w:ascii="Cambria" w:hAnsi="Cambria" w:eastAsia="ＭＳ 明朝" w:cs="Cambria" w:asciiTheme="minorHAnsi" w:hAnsiTheme="minorHAnsi" w:eastAsiaTheme="minorEastAsia" w:csTheme="minorBidi"/>
+                <w:sz w:val="22"/>
+                <w:szCs w:val="22"/>
+              </w:rPr>
               <w:t xml:space="preserve">  |  </w:t>
             </w:r>
             <w:r>
               <w:rPr>
-                <w:rFonts w:ascii="Calibri" w:hAnsi="Calibri"/>
+                <w:rFonts w:ascii="Calibri" w:hAnsi="Calibri" w:eastAsia="ＭＳ 明朝" w:cs="Calibri" w:eastAsiaTheme="minorEastAsia" w:csTheme="minorBidi"/>
                 <w:b/>
+                <w:bCs/>
                 <w:color w:val="475569"/>
                 <w:sz w:val="17"/>
+                <w:szCs w:val="22"/>
               </w:rPr>
               <w:t xml:space="preserve">GitHub: </w:t>
             </w:r>
             <w:hyperlink r:id="rId12">
               <w:r>
                 <w:rPr>
+                  <w:rFonts w:ascii="Cambria" w:hAnsi="Cambria" w:eastAsia="ＭＳ 明朝" w:cs="Cambria" w:asciiTheme="minorHAnsi" w:hAnsiTheme="minorHAnsi" w:eastAsiaTheme="minorEastAsia" w:csTheme="minorBidi"/>
                   <w:color w:val="0284C7"/>
+                  <w:sz w:val="22"/>
+                  <w:szCs w:val="22"/>
                   <w:u w:val="single"/>
                 </w:rPr>
                 <w:t>github.com/Riodarma002</w:t>
               </w:r>
             </w:hyperlink>
             <w:r>
+              <w:rPr>
+                <w:rFonts w:ascii="Cambria" w:hAnsi="Cambria" w:eastAsia="ＭＳ 明朝" w:cs="Cambria" w:asciiTheme="minorHAnsi" w:hAnsiTheme="minorHAnsi" w:eastAsiaTheme="minorEastAsia" w:csTheme="minorBidi"/>
+                <w:sz w:val="22"/>
+                <w:szCs w:val="22"/>
+              </w:rPr>
               <w:t xml:space="preserve">  |  </w:t>
             </w:r>
             <w:r>
               <w:rPr>
-                <w:rFonts w:ascii="Calibri" w:hAnsi="Calibri"/>
+                <w:rFonts w:ascii="Calibri" w:hAnsi="Calibri" w:eastAsia="ＭＳ 明朝" w:cs="Calibri" w:eastAsiaTheme="minorEastAsia" w:csTheme="minorBidi"/>
                 <w:b/>
+                <w:bCs/>
                 <w:color w:val="475569"/>
                 <w:sz w:val="17"/>
+                <w:szCs w:val="22"/>
               </w:rPr>
               <w:t xml:space="preserve">Drive: </w:t>
             </w:r>
             <w:hyperlink r:id="rId13">
               <w:r>
                 <w:rPr>
+                  <w:rFonts w:ascii="Cambria" w:hAnsi="Cambria" w:eastAsia="ＭＳ 明朝" w:cs="Cambria" w:asciiTheme="minorHAnsi" w:hAnsiTheme="minorHAnsi" w:eastAsiaTheme="minorEastAsia" w:csTheme="minorBidi"/>
                   <w:color w:val="0284C7"/>
+                  <w:sz w:val="22"/>
+                  <w:szCs w:val="22"/>
                   <w:u w:val="single"/>
                 </w:rPr>
                 <w:t>Folder Portofolio</w:t>
@@ -195,14 +254,14 @@
         </w:tc>
         <w:tc>
           <w:tcPr>
-            <w:tcW w:type="dxa" w:w="1872"/>
-            <w:vAlign w:val="center"/>
+            <w:tcW w:w="1872" w:type="dxa"/>
             <w:tcMar>
               <w:top w:w="0" w:type="dxa"/>
+              <w:left w:w="50" w:type="dxa"/>
               <w:bottom w:w="0" w:type="dxa"/>
-              <w:left w:w="50" w:type="dxa"/>
               <w:right w:w="0" w:type="dxa"/>
             </w:tcMar>
+            <w:vAlign w:val="center"/>
           </w:tcPr>
           <w:p>
             <w:pPr>
@@ -210,21 +269,22 @@
             </w:pPr>
             <w:r>
               <w:drawing>
-                <wp:inline xmlns:a="http://schemas.openxmlformats.org/drawingml/2006/main" xmlns:pic="http://schemas.openxmlformats.org/drawingml/2006/picture">
-                  <wp:extent cx="960120" cy="1286561"/>
-                  <wp:docPr id="1" name="Picture 1"/>
+                <wp:inline distT="0" distB="0" distL="0" distR="0">
+                  <wp:extent cx="962025" cy="1285875"/>
+                  <wp:effectExtent l="0" t="0" r="0" b="0"/>
+                  <wp:docPr id="100000" name="Picture 100000"/>
                   <wp:cNvGraphicFramePr>
-                    <a:graphicFrameLocks noChangeAspect="1"/>
+                    <a:graphicFrameLocks xmlns:a="http://schemas.openxmlformats.org/drawingml/2006/main" noChangeAspect="1"/>
                   </wp:cNvGraphicFramePr>
-                  <a:graphic>
+                  <a:graphic xmlns:a="http://schemas.openxmlformats.org/drawingml/2006/main">
                     <a:graphicData uri="http://schemas.openxmlformats.org/drawingml/2006/picture">
-                      <pic:pic>
+                      <pic:pic xmlns:pic="http://schemas.openxmlformats.org/drawingml/2006/picture">
                         <pic:nvPicPr>
-                          <pic:cNvPr id="0" name="foto_rio_formal.jpg"/>
+                          <pic:cNvPr id="100000" name="image100000"/>
                           <pic:cNvPicPr/>
                         </pic:nvPicPr>
                         <pic:blipFill>
-                          <a:blip r:embed="rId14"/>
+                          <a:blip r:embed="rId16"/>
                           <a:stretch>
                             <a:fillRect/>
                           </a:stretch>
@@ -232,9 +292,11 @@
                         <pic:spPr>
                           <a:xfrm>
                             <a:off x="0" y="0"/>
-                            <a:ext cx="960120" cy="1286561"/>
+                            <a:ext cx="962025" cy="1285875"/>
                           </a:xfrm>
-                          <a:prstGeom prst="rect"/>
+                          <a:prstGeom prst="rect">
+                            <a:avLst/>
+                          </a:prstGeom>
                         </pic:spPr>
                       </pic:pic>
                     </a:graphicData>
@@ -249,17 +311,19 @@
     <w:p>
       <w:pPr>
         <w:keepNext/>
-        <w:spacing w:before="180" w:after="40"/>
         <w:pBdr>
           <w:bottom w:val="single" w:sz="6" w:space="2" w:color="0284C7"/>
         </w:pBdr>
+        <w:spacing w:before="180" w:after="40"/>
       </w:pPr>
       <w:r>
         <w:rPr>
-          <w:rFonts w:ascii="Calibri" w:hAnsi="Calibri"/>
+          <w:rFonts w:ascii="Calibri" w:hAnsi="Calibri" w:eastAsia="ＭＳ 明朝" w:cs="Calibri" w:eastAsiaTheme="minorEastAsia" w:csTheme="minorBidi"/>
           <w:b/>
+          <w:bCs/>
           <w:color w:val="0F172A"/>
           <w:sz w:val="22"/>
+          <w:szCs w:val="22"/>
         </w:rPr>
         <w:t>RINGKASAN PROFESIONAL</w:t>
       </w:r>
@@ -270,9 +334,10 @@
       </w:pPr>
       <w:r>
         <w:rPr>
-          <w:rFonts w:ascii="Calibri" w:hAnsi="Calibri"/>
+          <w:rFonts w:ascii="Calibri" w:hAnsi="Calibri" w:eastAsia="ＭＳ 明朝" w:cs="Calibri" w:eastAsiaTheme="minorEastAsia" w:csTheme="minorBidi"/>
           <w:color w:val="1E293B"/>
           <w:sz w:val="17"/>
+          <w:szCs w:val="22"/>
         </w:rPr>
         <w:t>Software &amp; Data Engineer dengan pengalaman profesional lebih dari 7 tahun dalam merancang aplikasi desktop dan platform web operasional, arsitektur data terpadu, otomatisasi pipeline ETL, serta sistem informasi geospasial (GIS). Berpengalaman memimpin inisiatif digitalisasi operasional armada di PT. Mega Global Energy melalui perancangan Fleet Management System (FMS), pelacakan GPS armada terintegrasi, modul geofencing, serta visualisasi data analitik berbasis Python, Vue.js, dan Power BI. Memiliki rekam jejak enterprise dalam pemodelan data geospasial kelistrikan ArcGIS untuk sinkronisasi aset ke IBM MAXIMO PT PLN (Persero) bersama PT. Quadran Inovasi Karya Bersama, riset antarmuka pengguna (UX Research) di PT. Telkom Indonesia, serta mengantongi sertifikasi kompetensi resmi Pengawas Operasional Pertama (POP) dari BNSP. Terbukti andal dalam menghubungkan kebutuhan operasional lapangan dengan arsitektur teknologi yang efisien, terukur, dan akurat.</w:t>
       </w:r>
@@ -280,17 +345,19 @@
     <w:p>
       <w:pPr>
         <w:keepNext/>
-        <w:spacing w:before="180" w:after="40"/>
         <w:pBdr>
           <w:bottom w:val="single" w:sz="6" w:space="2" w:color="0284C7"/>
         </w:pBdr>
+        <w:spacing w:before="180" w:after="40"/>
       </w:pPr>
       <w:r>
         <w:rPr>
-          <w:rFonts w:ascii="Calibri" w:hAnsi="Calibri"/>
+          <w:rFonts w:ascii="Calibri" w:hAnsi="Calibri" w:eastAsia="ＭＳ 明朝" w:cs="Calibri" w:eastAsiaTheme="minorEastAsia" w:csTheme="minorBidi"/>
           <w:b/>
+          <w:bCs/>
           <w:color w:val="0F172A"/>
           <w:sz w:val="22"/>
+          <w:szCs w:val="22"/>
         </w:rPr>
         <w:t>KOMPETENSI INTI &amp; KEAHLIAN TEKNIS</w:t>
       </w:r>
@@ -301,18 +368,21 @@
       </w:pPr>
       <w:r>
         <w:rPr>
-          <w:rFonts w:ascii="Calibri" w:hAnsi="Calibri"/>
+          <w:rFonts w:ascii="Calibri" w:hAnsi="Calibri" w:eastAsia="ＭＳ 明朝" w:cs="Calibri" w:eastAsiaTheme="minorEastAsia" w:csTheme="minorBidi"/>
           <w:b/>
+          <w:bCs/>
           <w:color w:val="0F172A"/>
           <w:sz w:val="17"/>
+          <w:szCs w:val="22"/>
         </w:rPr>
         <w:t xml:space="preserve">Software &amp; Web Engineering: </w:t>
       </w:r>
       <w:r>
         <w:rPr>
-          <w:rFonts w:ascii="Calibri" w:hAnsi="Calibri"/>
+          <w:rFonts w:ascii="Calibri" w:hAnsi="Calibri" w:eastAsia="ＭＳ 明朝" w:cs="Calibri" w:eastAsiaTheme="minorEastAsia" w:csTheme="minorBidi"/>
           <w:color w:val="1E293B"/>
           <w:sz w:val="17"/>
+          <w:szCs w:val="22"/>
         </w:rPr>
         <w:t>Python, JavaScript, Vue.js (Vue 3, Vite, Pinia), HTML5, CSS3, RESTful APIs, Desktop App Development (Tkinter, PyQt), Git &amp; GitHub Actions CI/CD.</w:t>
       </w:r>
@@ -323,18 +393,21 @@
       </w:pPr>
       <w:r>
         <w:rPr>
-          <w:rFonts w:ascii="Calibri" w:hAnsi="Calibri"/>
+          <w:rFonts w:ascii="Calibri" w:hAnsi="Calibri" w:eastAsia="ＭＳ 明朝" w:cs="Calibri" w:eastAsiaTheme="minorEastAsia" w:csTheme="minorBidi"/>
           <w:b/>
+          <w:bCs/>
           <w:color w:val="0F172A"/>
           <w:sz w:val="17"/>
+          <w:szCs w:val="22"/>
         </w:rPr>
         <w:t xml:space="preserve">Data Engineering &amp; GIS: </w:t>
       </w:r>
       <w:r>
         <w:rPr>
-          <w:rFonts w:ascii="Calibri" w:hAnsi="Calibri"/>
+          <w:rFonts w:ascii="Calibri" w:hAnsi="Calibri" w:eastAsia="ＭＳ 明朝" w:cs="Calibri" w:eastAsiaTheme="minorEastAsia" w:csTheme="minorBidi"/>
           <w:color w:val="1E293B"/>
           <w:sz w:val="17"/>
+          <w:szCs w:val="22"/>
         </w:rPr>
         <w:t>ArcGIS (Spatial Network, Digitasi Jaringan Listrik &amp; Kontur), MySQL, PostgreSQL, ETL Automation Pipeline, Data Modeling, IBM MAXIMO Enterprise Integration, Microsoft Power BI.</w:t>
       </w:r>
@@ -345,18 +418,21 @@
       </w:pPr>
       <w:r>
         <w:rPr>
-          <w:rFonts w:ascii="Calibri" w:hAnsi="Calibri"/>
+          <w:rFonts w:ascii="Calibri" w:hAnsi="Calibri" w:eastAsia="ＭＳ 明朝" w:cs="Calibri" w:eastAsiaTheme="minorEastAsia" w:csTheme="minorBidi"/>
           <w:b/>
+          <w:bCs/>
           <w:color w:val="0F172A"/>
           <w:sz w:val="17"/>
+          <w:szCs w:val="22"/>
         </w:rPr>
         <w:t xml:space="preserve">AI Tooling &amp; Otomasi: </w:t>
       </w:r>
       <w:r>
         <w:rPr>
-          <w:rFonts w:ascii="Calibri" w:hAnsi="Calibri"/>
+          <w:rFonts w:ascii="Calibri" w:hAnsi="Calibri" w:eastAsia="ＭＳ 明朝" w:cs="Calibri" w:eastAsiaTheme="minorEastAsia" w:csTheme="minorBidi"/>
           <w:color w:val="1E293B"/>
           <w:sz w:val="17"/>
+          <w:szCs w:val="22"/>
         </w:rPr>
         <w:t>Antigravity Agentic Workflows, Codex, Ollama (Local LLM), Claude Code, Hermes Agent, 9 Router, Prompt &amp; Pipeline Engineering.</w:t>
       </w:r>
@@ -367,18 +443,21 @@
       </w:pPr>
       <w:r>
         <w:rPr>
-          <w:rFonts w:ascii="Calibri" w:hAnsi="Calibri"/>
+          <w:rFonts w:ascii="Calibri" w:hAnsi="Calibri" w:eastAsia="ＭＳ 明朝" w:cs="Calibri" w:eastAsiaTheme="minorEastAsia" w:csTheme="minorBidi"/>
           <w:b/>
+          <w:bCs/>
           <w:color w:val="0F172A"/>
           <w:sz w:val="17"/>
+          <w:szCs w:val="22"/>
         </w:rPr>
         <w:t xml:space="preserve">UI/UX &amp; Desain Produk: </w:t>
       </w:r>
       <w:r>
         <w:rPr>
-          <w:rFonts w:ascii="Calibri" w:hAnsi="Calibri"/>
+          <w:rFonts w:ascii="Calibri" w:hAnsi="Calibri" w:eastAsia="ＭＳ 明朝" w:cs="Calibri" w:eastAsiaTheme="minorEastAsia" w:csTheme="minorBidi"/>
           <w:color w:val="1E293B"/>
           <w:sz w:val="17"/>
+          <w:szCs w:val="22"/>
         </w:rPr>
         <w:t>Figma UI/UX Design, Heuristic Evaluation, User Flow &amp; Information Architecture, Usability Testing, Adobe Photoshop, Adobe Illustrator.</w:t>
       </w:r>
@@ -389,18 +468,21 @@
       </w:pPr>
       <w:r>
         <w:rPr>
-          <w:rFonts w:ascii="Calibri" w:hAnsi="Calibri"/>
+          <w:rFonts w:ascii="Calibri" w:hAnsi="Calibri" w:eastAsia="ＭＳ 明朝" w:cs="Calibri" w:eastAsiaTheme="minorEastAsia" w:csTheme="minorBidi"/>
           <w:b/>
+          <w:bCs/>
           <w:color w:val="0F172A"/>
           <w:sz w:val="17"/>
+          <w:szCs w:val="22"/>
         </w:rPr>
         <w:t xml:space="preserve">Operasional &amp; Manajemen: </w:t>
       </w:r>
       <w:r>
         <w:rPr>
-          <w:rFonts w:ascii="Calibri" w:hAnsi="Calibri"/>
+          <w:rFonts w:ascii="Calibri" w:hAnsi="Calibri" w:eastAsia="ＭＳ 明朝" w:cs="Calibri" w:eastAsiaTheme="minorEastAsia" w:csTheme="minorBidi"/>
           <w:color w:val="1E293B"/>
           <w:sz w:val="17"/>
+          <w:szCs w:val="22"/>
         </w:rPr>
         <w:t>Sertifikasi BNSP POP (Pengawas Operasional Pertama), ERP Odoo, Advanced Microsoft Excel (Macro &amp; Formulas), Google Sheets, Fleet Management Systems (FMS), Tata Kelola Kontrak Proyek &amp; LPJ.</w:t>
       </w:r>
@@ -408,27 +490,35 @@
     <w:p>
       <w:pPr>
         <w:keepNext/>
-        <w:spacing w:before="180" w:after="40"/>
         <w:pBdr>
           <w:bottom w:val="single" w:sz="6" w:space="2" w:color="0284C7"/>
         </w:pBdr>
+        <w:spacing w:before="180" w:after="40"/>
       </w:pPr>
       <w:r>
         <w:rPr>
-          <w:rFonts w:ascii="Calibri" w:hAnsi="Calibri"/>
+          <w:rFonts w:ascii="Calibri" w:hAnsi="Calibri" w:eastAsia="ＭＳ 明朝" w:cs="Calibri" w:eastAsiaTheme="minorEastAsia" w:csTheme="minorBidi"/>
           <w:b/>
+          <w:bCs/>
           <w:color w:val="0F172A"/>
           <w:sz w:val="22"/>
+          <w:szCs w:val="22"/>
         </w:rPr>
         <w:t>PENGALAMAN KERJA</w:t>
       </w:r>
     </w:p>
     <w:tbl>
       <w:tblPr>
-        <w:tblW w:type="auto" w:w="0"/>
+        <w:tblW w:w="0" w:type="auto"/>
         <w:jc w:val="center"/>
         <w:tblLayout w:type="fixed"/>
-        <w:tblLook w:firstColumn="1" w:firstRow="1" w:lastColumn="0" w:lastRow="0" w:noHBand="0" w:noVBand="1" w:val="04A0"/>
+        <w:tblCellMar>
+          <w:top w:w="0" w:type="dxa"/>
+          <w:left w:w="108" w:type="dxa"/>
+          <w:bottom w:w="0" w:type="dxa"/>
+          <w:right w:w="108" w:type="dxa"/>
+        </w:tblCellMar>
+        <w:tblLook w:firstRow="1" w:firstColumn="1" w:noVBand="1"/>
       </w:tblPr>
       <w:tblGrid>
         <w:gridCol w:w="5400"/>
@@ -437,11 +527,11 @@
       <w:tr>
         <w:tc>
           <w:tcPr>
-            <w:tcW w:type="dxa" w:w="7920"/>
+            <w:tcW w:w="7920" w:type="dxa"/>
             <w:tcMar>
               <w:top w:w="30" w:type="dxa"/>
+              <w:left w:w="0" w:type="dxa"/>
               <w:bottom w:w="10" w:type="dxa"/>
-              <w:left w:w="0" w:type="dxa"/>
               <w:right w:w="0" w:type="dxa"/>
             </w:tcMar>
           </w:tcPr>
@@ -452,29 +542,37 @@
             </w:pPr>
             <w:r>
               <w:rPr>
-                <w:rFonts w:ascii="Calibri" w:hAnsi="Calibri"/>
+                <w:rFonts w:ascii="Calibri" w:hAnsi="Calibri" w:eastAsia="ＭＳ 明朝" w:cs="Calibri" w:eastAsiaTheme="minorEastAsia" w:csTheme="minorBidi"/>
                 <w:b/>
+                <w:bCs/>
                 <w:color w:val="0F172A"/>
                 <w:sz w:val="19"/>
+                <w:szCs w:val="22"/>
               </w:rPr>
               <w:t>Software &amp; Data Engineer (Foreman Planning)</w:t>
-              <w:br/>
+            </w:r>
+            <w:r>
+              <w:br w:type="textWrapping"/>
             </w:r>
             <w:r>
               <w:rPr>
-                <w:rFonts w:ascii="Calibri" w:hAnsi="Calibri"/>
+                <w:rFonts w:ascii="Calibri" w:hAnsi="Calibri" w:eastAsia="ＭＳ 明朝" w:cs="Calibri" w:eastAsiaTheme="minorEastAsia" w:csTheme="minorBidi"/>
                 <w:b/>
+                <w:bCs/>
                 <w:color w:val="0F172A"/>
                 <w:sz w:val="18"/>
+                <w:szCs w:val="22"/>
               </w:rPr>
               <w:t>PT. MEGA GLOBAL ENERGY</w:t>
             </w:r>
             <w:r>
               <w:rPr>
-                <w:rFonts w:ascii="Calibri" w:hAnsi="Calibri"/>
+                <w:rFonts w:ascii="Calibri" w:hAnsi="Calibri" w:eastAsia="ＭＳ 明朝" w:cs="Calibri" w:eastAsiaTheme="minorEastAsia" w:csTheme="minorBidi"/>
                 <w:i/>
+                <w:iCs/>
                 <w:color w:val="475569"/>
                 <w:sz w:val="17"/>
+                <w:szCs w:val="22"/>
               </w:rPr>
               <w:t xml:space="preserve"> | PT. GAM &amp; PT. INDEXIM / Site Operation</w:t>
             </w:r>
@@ -482,11 +580,11 @@
         </w:tc>
         <w:tc>
           <w:tcPr>
-            <w:tcW w:type="dxa" w:w="2880"/>
+            <w:tcW w:w="2880" w:type="dxa"/>
             <w:tcMar>
               <w:top w:w="30" w:type="dxa"/>
+              <w:left w:w="0" w:type="dxa"/>
               <w:bottom w:w="10" w:type="dxa"/>
-              <w:left w:w="0" w:type="dxa"/>
               <w:right w:w="0" w:type="dxa"/>
             </w:tcMar>
           </w:tcPr>
@@ -498,10 +596,12 @@
             </w:pPr>
             <w:r>
               <w:rPr>
-                <w:rFonts w:ascii="Calibri" w:hAnsi="Calibri"/>
+                <w:rFonts w:ascii="Calibri" w:hAnsi="Calibri" w:eastAsia="ＭＳ 明朝" w:cs="Calibri" w:eastAsiaTheme="minorEastAsia" w:csTheme="minorBidi"/>
                 <w:b/>
+                <w:bCs/>
                 <w:color w:val="475569"/>
                 <w:sz w:val="17"/>
+                <w:szCs w:val="22"/>
               </w:rPr>
               <w:t>Desember 2023 – Sekarang</w:t>
             </w:r>
@@ -513,12 +613,14 @@
       <w:pPr>
         <w:pStyle w:val="ListBullet"/>
         <w:spacing w:before="20" w:after="40" w:line="276" w:lineRule="auto"/>
+        <w:ind w:left="360" w:hanging="360"/>
       </w:pPr>
       <w:r>
         <w:rPr>
-          <w:rFonts w:ascii="Calibri" w:hAnsi="Calibri"/>
+          <w:rFonts w:ascii="Calibri" w:hAnsi="Calibri" w:eastAsia="ＭＳ 明朝" w:cs="Calibri" w:eastAsiaTheme="minorEastAsia" w:csTheme="minorBidi"/>
           <w:color w:val="1E293B"/>
           <w:sz w:val="17"/>
+          <w:szCs w:val="22"/>
         </w:rPr>
         <w:t>Merancang, membangun, dan memelihara aplikasi desktop serta platform web operasional internal (Fleet Management System/FMS, Monitoring Bus, Monitoring Dump Truck, dan Monitoring Fueltruck) untuk pemantauan unit secara real-time.</w:t>
       </w:r>
@@ -527,12 +629,14 @@
       <w:pPr>
         <w:pStyle w:val="ListBullet"/>
         <w:spacing w:before="20" w:after="40" w:line="276" w:lineRule="auto"/>
+        <w:ind w:left="360" w:hanging="360"/>
       </w:pPr>
       <w:r>
         <w:rPr>
-          <w:rFonts w:ascii="Calibri" w:hAnsi="Calibri"/>
+          <w:rFonts w:ascii="Calibri" w:hAnsi="Calibri" w:eastAsia="ＭＳ 明朝" w:cs="Calibri" w:eastAsiaTheme="minorEastAsia" w:csTheme="minorBidi"/>
           <w:color w:val="1E293B"/>
           <w:sz w:val="17"/>
+          <w:szCs w:val="22"/>
         </w:rPr>
         <w:t>Mengembangkan arsitektur pelacakan GPS armada terintegrasi dan modul geofencing virtual guna membatasi serta melacak mobilitas unit operasional tambang dengan presisi tinggi.</w:t>
       </w:r>
@@ -541,12 +645,14 @@
       <w:pPr>
         <w:pStyle w:val="ListBullet"/>
         <w:spacing w:before="20" w:after="40" w:line="276" w:lineRule="auto"/>
+        <w:ind w:left="360" w:hanging="360"/>
       </w:pPr>
       <w:r>
         <w:rPr>
-          <w:rFonts w:ascii="Calibri" w:hAnsi="Calibri"/>
+          <w:rFonts w:ascii="Calibri" w:hAnsi="Calibri" w:eastAsia="ＭＳ 明朝" w:cs="Calibri" w:eastAsiaTheme="minorEastAsia" w:csTheme="minorBidi"/>
           <w:color w:val="1E293B"/>
           <w:sz w:val="17"/>
+          <w:szCs w:val="22"/>
         </w:rPr>
         <w:t>Membangun dashboard Business Intelligence interaktif menggunakan Power BI, Python, dan Vue.js untuk analisis capaian target produksi harian, status armada, serta efisiensi jam kerja operasional.</w:t>
       </w:r>
@@ -555,12 +661,14 @@
       <w:pPr>
         <w:pStyle w:val="ListBullet"/>
         <w:spacing w:before="20" w:after="40" w:line="276" w:lineRule="auto"/>
+        <w:ind w:left="360" w:hanging="360"/>
       </w:pPr>
       <w:r>
         <w:rPr>
-          <w:rFonts w:ascii="Calibri" w:hAnsi="Calibri"/>
+          <w:rFonts w:ascii="Calibri" w:hAnsi="Calibri" w:eastAsia="ＭＳ 明朝" w:cs="Calibri" w:eastAsiaTheme="minorEastAsia" w:csTheme="minorBidi"/>
           <w:color w:val="1E293B"/>
           <w:sz w:val="17"/>
+          <w:szCs w:val="22"/>
         </w:rPr>
         <w:t>Mengembangkan platform web Daily MS Rental (planning.mge.co.id) dan aplikasi dispatch untuk mengawasi kondisi unit running per-shift, kendala delay, dan breakdown armada.</w:t>
       </w:r>
@@ -569,22 +677,30 @@
       <w:pPr>
         <w:pStyle w:val="ListBullet"/>
         <w:spacing w:before="20" w:after="40" w:line="276" w:lineRule="auto"/>
+        <w:ind w:left="360" w:hanging="360"/>
       </w:pPr>
       <w:r>
         <w:rPr>
-          <w:rFonts w:ascii="Calibri" w:hAnsi="Calibri"/>
+          <w:rFonts w:ascii="Calibri" w:hAnsi="Calibri" w:eastAsia="ＭＳ 明朝" w:cs="Calibri" w:eastAsiaTheme="minorEastAsia" w:csTheme="minorBidi"/>
           <w:color w:val="1E293B"/>
           <w:sz w:val="17"/>
+          <w:szCs w:val="22"/>
         </w:rPr>
         <w:t>Melakukan pemrosesan dan analisis data harian konsumsi bahan bakar (fuel consumption) dan produktivitas fleet untuk mendukung pengambilan keputusan strategis manajemen operasional.</w:t>
       </w:r>
     </w:p>
     <w:tbl>
       <w:tblPr>
-        <w:tblW w:type="auto" w:w="0"/>
+        <w:tblW w:w="0" w:type="auto"/>
         <w:jc w:val="center"/>
         <w:tblLayout w:type="fixed"/>
-        <w:tblLook w:firstColumn="1" w:firstRow="1" w:lastColumn="0" w:lastRow="0" w:noHBand="0" w:noVBand="1" w:val="04A0"/>
+        <w:tblCellMar>
+          <w:top w:w="0" w:type="dxa"/>
+          <w:left w:w="108" w:type="dxa"/>
+          <w:bottom w:w="0" w:type="dxa"/>
+          <w:right w:w="108" w:type="dxa"/>
+        </w:tblCellMar>
+        <w:tblLook w:firstRow="1" w:firstColumn="1" w:noVBand="1"/>
       </w:tblPr>
       <w:tblGrid>
         <w:gridCol w:w="5400"/>
@@ -593,11 +709,11 @@
       <w:tr>
         <w:tc>
           <w:tcPr>
-            <w:tcW w:type="dxa" w:w="7920"/>
+            <w:tcW w:w="7920" w:type="dxa"/>
             <w:tcMar>
               <w:top w:w="30" w:type="dxa"/>
+              <w:left w:w="0" w:type="dxa"/>
               <w:bottom w:w="10" w:type="dxa"/>
-              <w:left w:w="0" w:type="dxa"/>
               <w:right w:w="0" w:type="dxa"/>
             </w:tcMar>
           </w:tcPr>
@@ -608,29 +724,37 @@
             </w:pPr>
             <w:r>
               <w:rPr>
-                <w:rFonts w:ascii="Calibri" w:hAnsi="Calibri"/>
+                <w:rFonts w:ascii="Calibri" w:hAnsi="Calibri" w:eastAsia="ＭＳ 明朝" w:cs="Calibri" w:eastAsiaTheme="minorEastAsia" w:csTheme="minorBidi"/>
                 <w:b/>
+                <w:bCs/>
                 <w:color w:val="0F172A"/>
                 <w:sz w:val="19"/>
+                <w:szCs w:val="22"/>
               </w:rPr>
               <w:t>Data Engineer &amp; Drafter GIS Jaringan Listrik</w:t>
-              <w:br/>
+            </w:r>
+            <w:r>
+              <w:br w:type="textWrapping"/>
             </w:r>
             <w:r>
               <w:rPr>
-                <w:rFonts w:ascii="Calibri" w:hAnsi="Calibri"/>
+                <w:rFonts w:ascii="Calibri" w:hAnsi="Calibri" w:eastAsia="ＭＳ 明朝" w:cs="Calibri" w:eastAsiaTheme="minorEastAsia" w:csTheme="minorBidi"/>
                 <w:b/>
+                <w:bCs/>
                 <w:color w:val="0F172A"/>
                 <w:sz w:val="18"/>
+                <w:szCs w:val="22"/>
               </w:rPr>
               <w:t>PT. QUADRAN INOVASI KARYA BERSAMA</w:t>
             </w:r>
             <w:r>
               <w:rPr>
-                <w:rFonts w:ascii="Calibri" w:hAnsi="Calibri"/>
+                <w:rFonts w:ascii="Calibri" w:hAnsi="Calibri" w:eastAsia="ＭＳ 明朝" w:cs="Calibri" w:eastAsiaTheme="minorEastAsia" w:csTheme="minorBidi"/>
                 <w:i/>
+                <w:iCs/>
                 <w:color w:val="475569"/>
                 <w:sz w:val="17"/>
+                <w:szCs w:val="22"/>
               </w:rPr>
               <w:t xml:space="preserve"> | Bandung, Jawa Barat (Mitra PT PLN)</w:t>
             </w:r>
@@ -638,11 +762,11 @@
         </w:tc>
         <w:tc>
           <w:tcPr>
-            <w:tcW w:type="dxa" w:w="2880"/>
+            <w:tcW w:w="2880" w:type="dxa"/>
             <w:tcMar>
               <w:top w:w="30" w:type="dxa"/>
+              <w:left w:w="0" w:type="dxa"/>
               <w:bottom w:w="10" w:type="dxa"/>
-              <w:left w:w="0" w:type="dxa"/>
               <w:right w:w="0" w:type="dxa"/>
             </w:tcMar>
           </w:tcPr>
@@ -654,10 +778,12 @@
             </w:pPr>
             <w:r>
               <w:rPr>
-                <w:rFonts w:ascii="Calibri" w:hAnsi="Calibri"/>
+                <w:rFonts w:ascii="Calibri" w:hAnsi="Calibri" w:eastAsia="ＭＳ 明朝" w:cs="Calibri" w:eastAsiaTheme="minorEastAsia" w:csTheme="minorBidi"/>
                 <w:b/>
+                <w:bCs/>
                 <w:color w:val="475569"/>
                 <w:sz w:val="17"/>
+                <w:szCs w:val="22"/>
               </w:rPr>
               <w:t>September 2021 – Oktober 2023</w:t>
             </w:r>
@@ -669,12 +795,14 @@
       <w:pPr>
         <w:pStyle w:val="ListBullet"/>
         <w:spacing w:before="20" w:after="40" w:line="276" w:lineRule="auto"/>
+        <w:ind w:left="360" w:hanging="360"/>
       </w:pPr>
       <w:r>
         <w:rPr>
-          <w:rFonts w:ascii="Calibri" w:hAnsi="Calibri"/>
+          <w:rFonts w:ascii="Calibri" w:hAnsi="Calibri" w:eastAsia="ＭＳ 明朝" w:cs="Calibri" w:eastAsiaTheme="minorEastAsia" w:csTheme="minorBidi"/>
           <w:color w:val="1E293B"/>
           <w:sz w:val="17"/>
+          <w:szCs w:val="22"/>
         </w:rPr>
         <w:t>Mengolah, memverifikasi, dan memodelkan data survei koordinat lapangan ke dalam sistem informasi geografis ArcGIS untuk pemetaan jaringan distribusi kelistrikan berskala enterprise.</w:t>
       </w:r>
@@ -683,12 +811,14 @@
       <w:pPr>
         <w:pStyle w:val="ListBullet"/>
         <w:spacing w:before="20" w:after="40" w:line="276" w:lineRule="auto"/>
+        <w:ind w:left="360" w:hanging="360"/>
       </w:pPr>
       <w:r>
         <w:rPr>
-          <w:rFonts w:ascii="Calibri" w:hAnsi="Calibri"/>
+          <w:rFonts w:ascii="Calibri" w:hAnsi="Calibri" w:eastAsia="ＭＳ 明朝" w:cs="Calibri" w:eastAsiaTheme="minorEastAsia" w:csTheme="minorBidi"/>
           <w:color w:val="1E293B"/>
           <w:sz w:val="17"/>
+          <w:szCs w:val="22"/>
         </w:rPr>
         <w:t>Memetakan dan mendigitasi komponen jaringan kelistrikan tegangan menengah dan rendah (Gardu Induk, SUTM, JTR, Gardu Distribusi CBTG U, Switch) bermitra langsung dengan PT PLN (Persero).</w:t>
       </w:r>
@@ -697,12 +827,14 @@
       <w:pPr>
         <w:pStyle w:val="ListBullet"/>
         <w:spacing w:before="20" w:after="40" w:line="276" w:lineRule="auto"/>
+        <w:ind w:left="360" w:hanging="360"/>
       </w:pPr>
       <w:r>
         <w:rPr>
-          <w:rFonts w:ascii="Calibri" w:hAnsi="Calibri"/>
+          <w:rFonts w:ascii="Calibri" w:hAnsi="Calibri" w:eastAsia="ＭＳ 明朝" w:cs="Calibri" w:eastAsiaTheme="minorEastAsia" w:csTheme="minorBidi"/>
           <w:color w:val="1E293B"/>
           <w:sz w:val="17"/>
+          <w:szCs w:val="22"/>
         </w:rPr>
         <w:t>Mengembangkan skrip otomasi pipeline konversi data spasial (AR text format) menjadi data tabular terstruktur (Excel/CSV) untuk sinkronisasi aset ke sistem enterprise IBM MAXIMO PLN.</w:t>
       </w:r>
@@ -711,22 +843,30 @@
       <w:pPr>
         <w:pStyle w:val="ListBullet"/>
         <w:spacing w:before="20" w:after="40" w:line="276" w:lineRule="auto"/>
+        <w:ind w:left="360" w:hanging="360"/>
       </w:pPr>
       <w:r>
         <w:rPr>
-          <w:rFonts w:ascii="Calibri" w:hAnsi="Calibri"/>
+          <w:rFonts w:ascii="Calibri" w:hAnsi="Calibri" w:eastAsia="ＭＳ 明朝" w:cs="Calibri" w:eastAsiaTheme="minorEastAsia" w:csTheme="minorBidi"/>
           <w:color w:val="1E293B"/>
           <w:sz w:val="17"/>
+          <w:szCs w:val="22"/>
         </w:rPr>
         <w:t>Melakukan validasi dan verifikasi teknis kesesuaian gambar as-built dengan konstruksi fisik aktual di lapangan guna menjamin integritas database aset kelistrikan.</w:t>
       </w:r>
     </w:p>
     <w:tbl>
       <w:tblPr>
-        <w:tblW w:type="auto" w:w="0"/>
+        <w:tblW w:w="0" w:type="auto"/>
         <w:jc w:val="center"/>
         <w:tblLayout w:type="fixed"/>
-        <w:tblLook w:firstColumn="1" w:firstRow="1" w:lastColumn="0" w:lastRow="0" w:noHBand="0" w:noVBand="1" w:val="04A0"/>
+        <w:tblCellMar>
+          <w:top w:w="0" w:type="dxa"/>
+          <w:left w:w="108" w:type="dxa"/>
+          <w:bottom w:w="0" w:type="dxa"/>
+          <w:right w:w="108" w:type="dxa"/>
+        </w:tblCellMar>
+        <w:tblLook w:firstRow="1" w:firstColumn="1" w:noVBand="1"/>
       </w:tblPr>
       <w:tblGrid>
         <w:gridCol w:w="5400"/>
@@ -735,11 +875,11 @@
       <w:tr>
         <w:tc>
           <w:tcPr>
-            <w:tcW w:type="dxa" w:w="7920"/>
+            <w:tcW w:w="7920" w:type="dxa"/>
             <w:tcMar>
               <w:top w:w="30" w:type="dxa"/>
+              <w:left w:w="0" w:type="dxa"/>
               <w:bottom w:w="10" w:type="dxa"/>
-              <w:left w:w="0" w:type="dxa"/>
               <w:right w:w="0" w:type="dxa"/>
             </w:tcMar>
           </w:tcPr>
@@ -750,29 +890,37 @@
             </w:pPr>
             <w:r>
               <w:rPr>
-                <w:rFonts w:ascii="Calibri" w:hAnsi="Calibri"/>
+                <w:rFonts w:ascii="Calibri" w:hAnsi="Calibri" w:eastAsia="ＭＳ 明朝" w:cs="Calibri" w:eastAsiaTheme="minorEastAsia" w:csTheme="minorBidi"/>
                 <w:b/>
+                <w:bCs/>
                 <w:color w:val="0F172A"/>
                 <w:sz w:val="19"/>
+                <w:szCs w:val="22"/>
               </w:rPr>
               <w:t>Administrasi Umum &amp; Pengelola LPJ</w:t>
-              <w:br/>
+            </w:r>
+            <w:r>
+              <w:br w:type="textWrapping"/>
             </w:r>
             <w:r>
               <w:rPr>
-                <w:rFonts w:ascii="Calibri" w:hAnsi="Calibri"/>
+                <w:rFonts w:ascii="Calibri" w:hAnsi="Calibri" w:eastAsia="ＭＳ 明朝" w:cs="Calibri" w:eastAsiaTheme="minorEastAsia" w:csTheme="minorBidi"/>
                 <w:b/>
+                <w:bCs/>
                 <w:color w:val="0F172A"/>
                 <w:sz w:val="18"/>
+                <w:szCs w:val="22"/>
               </w:rPr>
               <w:t>PT. KA PROPERTI MANAJEMEN</w:t>
             </w:r>
             <w:r>
               <w:rPr>
-                <w:rFonts w:ascii="Calibri" w:hAnsi="Calibri"/>
+                <w:rFonts w:ascii="Calibri" w:hAnsi="Calibri" w:eastAsia="ＭＳ 明朝" w:cs="Calibri" w:eastAsiaTheme="minorEastAsia" w:csTheme="minorBidi"/>
                 <w:i/>
+                <w:iCs/>
                 <w:color w:val="475569"/>
                 <w:sz w:val="17"/>
+                <w:szCs w:val="22"/>
               </w:rPr>
               <w:t xml:space="preserve"> | Proyek Reaktivasi Cibatu – Garut</w:t>
             </w:r>
@@ -780,11 +928,11 @@
         </w:tc>
         <w:tc>
           <w:tcPr>
-            <w:tcW w:type="dxa" w:w="2880"/>
+            <w:tcW w:w="2880" w:type="dxa"/>
             <w:tcMar>
               <w:top w:w="30" w:type="dxa"/>
+              <w:left w:w="0" w:type="dxa"/>
               <w:bottom w:w="10" w:type="dxa"/>
-              <w:left w:w="0" w:type="dxa"/>
               <w:right w:w="0" w:type="dxa"/>
             </w:tcMar>
           </w:tcPr>
@@ -796,10 +944,12 @@
             </w:pPr>
             <w:r>
               <w:rPr>
-                <w:rFonts w:ascii="Calibri" w:hAnsi="Calibri"/>
+                <w:rFonts w:ascii="Calibri" w:hAnsi="Calibri" w:eastAsia="ＭＳ 明朝" w:cs="Calibri" w:eastAsiaTheme="minorEastAsia" w:csTheme="minorBidi"/>
                 <w:b/>
+                <w:bCs/>
                 <w:color w:val="475569"/>
                 <w:sz w:val="17"/>
+                <w:szCs w:val="22"/>
               </w:rPr>
               <w:t>September 2019 – Mei 2021</w:t>
             </w:r>
@@ -811,12 +961,14 @@
       <w:pPr>
         <w:pStyle w:val="ListBullet"/>
         <w:spacing w:before="20" w:after="40" w:line="276" w:lineRule="auto"/>
+        <w:ind w:left="360" w:hanging="360"/>
       </w:pPr>
       <w:r>
         <w:rPr>
-          <w:rFonts w:ascii="Calibri" w:hAnsi="Calibri"/>
+          <w:rFonts w:ascii="Calibri" w:hAnsi="Calibri" w:eastAsia="ＭＳ 明朝" w:cs="Calibri" w:eastAsiaTheme="minorEastAsia" w:csTheme="minorBidi"/>
           <w:color w:val="1E293B"/>
           <w:sz w:val="17"/>
+          <w:szCs w:val="22"/>
         </w:rPr>
         <w:t>Mengelola tertib administrasi berkas legal konstruksi proyek reaktivasi jalur kereta api, meliputi SPK, BAP, BAST basborong, dan surat perjanjian kontrak pegawai.</w:t>
       </w:r>
@@ -825,12 +977,14 @@
       <w:pPr>
         <w:pStyle w:val="ListBullet"/>
         <w:spacing w:before="20" w:after="40" w:line="276" w:lineRule="auto"/>
+        <w:ind w:left="360" w:hanging="360"/>
       </w:pPr>
       <w:r>
         <w:rPr>
-          <w:rFonts w:ascii="Calibri" w:hAnsi="Calibri"/>
+          <w:rFonts w:ascii="Calibri" w:hAnsi="Calibri" w:eastAsia="ＭＳ 明朝" w:cs="Calibri" w:eastAsiaTheme="minorEastAsia" w:csTheme="minorBidi"/>
           <w:color w:val="1E293B"/>
           <w:sz w:val="17"/>
+          <w:szCs w:val="22"/>
         </w:rPr>
         <w:t>Menyusun Laporan Pertanggungjawaban (LPJ) keuangan dan verifikasi progres fisik pekerjaan borongan sesuai jadwal dan standar audit PT KA Properti Manajemen.</w:t>
       </w:r>
@@ -839,22 +993,30 @@
       <w:pPr>
         <w:pStyle w:val="ListBullet"/>
         <w:spacing w:before="20" w:after="40" w:line="276" w:lineRule="auto"/>
+        <w:ind w:left="360" w:hanging="360"/>
       </w:pPr>
       <w:r>
         <w:rPr>
-          <w:rFonts w:ascii="Calibri" w:hAnsi="Calibri"/>
+          <w:rFonts w:ascii="Calibri" w:hAnsi="Calibri" w:eastAsia="ＭＳ 明朝" w:cs="Calibri" w:eastAsiaTheme="minorEastAsia" w:csTheme="minorBidi"/>
           <w:color w:val="1E293B"/>
           <w:sz w:val="17"/>
+          <w:szCs w:val="22"/>
         </w:rPr>
         <w:t>Memastikan kelancaran alur verifikasi berkas dan kepatuhan administratif antara vendor kontraktor pelaksana, konsultan, dan manajemen pusat.</w:t>
       </w:r>
     </w:p>
     <w:tbl>
       <w:tblPr>
-        <w:tblW w:type="auto" w:w="0"/>
+        <w:tblW w:w="0" w:type="auto"/>
         <w:jc w:val="center"/>
         <w:tblLayout w:type="fixed"/>
-        <w:tblLook w:firstColumn="1" w:firstRow="1" w:lastColumn="0" w:lastRow="0" w:noHBand="0" w:noVBand="1" w:val="04A0"/>
+        <w:tblCellMar>
+          <w:top w:w="0" w:type="dxa"/>
+          <w:left w:w="108" w:type="dxa"/>
+          <w:bottom w:w="0" w:type="dxa"/>
+          <w:right w:w="108" w:type="dxa"/>
+        </w:tblCellMar>
+        <w:tblLook w:firstRow="1" w:firstColumn="1" w:noVBand="1"/>
       </w:tblPr>
       <w:tblGrid>
         <w:gridCol w:w="5400"/>
@@ -863,11 +1025,11 @@
       <w:tr>
         <w:tc>
           <w:tcPr>
-            <w:tcW w:type="dxa" w:w="7920"/>
+            <w:tcW w:w="7920" w:type="dxa"/>
             <w:tcMar>
               <w:top w:w="30" w:type="dxa"/>
+              <w:left w:w="0" w:type="dxa"/>
               <w:bottom w:w="10" w:type="dxa"/>
-              <w:left w:w="0" w:type="dxa"/>
               <w:right w:w="0" w:type="dxa"/>
             </w:tcMar>
           </w:tcPr>
@@ -878,29 +1040,37 @@
             </w:pPr>
             <w:r>
               <w:rPr>
-                <w:rFonts w:ascii="Calibri" w:hAnsi="Calibri"/>
+                <w:rFonts w:ascii="Calibri" w:hAnsi="Calibri" w:eastAsia="ＭＳ 明朝" w:cs="Calibri" w:eastAsiaTheme="minorEastAsia" w:csTheme="minorBidi"/>
                 <w:b/>
+                <w:bCs/>
                 <w:color w:val="0F172A"/>
                 <w:sz w:val="19"/>
+                <w:szCs w:val="22"/>
               </w:rPr>
               <w:t>Admin &amp; Pengawas Alat Berat</w:t>
-              <w:br/>
+            </w:r>
+            <w:r>
+              <w:br w:type="textWrapping"/>
             </w:r>
             <w:r>
               <w:rPr>
-                <w:rFonts w:ascii="Calibri" w:hAnsi="Calibri"/>
+                <w:rFonts w:ascii="Calibri" w:hAnsi="Calibri" w:eastAsia="ＭＳ 明朝" w:cs="Calibri" w:eastAsiaTheme="minorEastAsia" w:csTheme="minorBidi"/>
                 <w:b/>
+                <w:bCs/>
                 <w:color w:val="0F172A"/>
                 <w:sz w:val="18"/>
+                <w:szCs w:val="22"/>
               </w:rPr>
               <w:t>PT. SUMBER DAYA ARGA (SDA)</w:t>
             </w:r>
             <w:r>
               <w:rPr>
-                <w:rFonts w:ascii="Calibri" w:hAnsi="Calibri"/>
+                <w:rFonts w:ascii="Calibri" w:hAnsi="Calibri" w:eastAsia="ＭＳ 明朝" w:cs="Calibri" w:eastAsiaTheme="minorEastAsia" w:csTheme="minorBidi"/>
                 <w:i/>
+                <w:iCs/>
                 <w:color w:val="475569"/>
                 <w:sz w:val="17"/>
+                <w:szCs w:val="22"/>
               </w:rPr>
               <w:t xml:space="preserve"> | Area Proyek Lapangan</w:t>
             </w:r>
@@ -908,11 +1078,11 @@
         </w:tc>
         <w:tc>
           <w:tcPr>
-            <w:tcW w:type="dxa" w:w="2880"/>
+            <w:tcW w:w="2880" w:type="dxa"/>
             <w:tcMar>
               <w:top w:w="30" w:type="dxa"/>
+              <w:left w:w="0" w:type="dxa"/>
               <w:bottom w:w="10" w:type="dxa"/>
-              <w:left w:w="0" w:type="dxa"/>
               <w:right w:w="0" w:type="dxa"/>
             </w:tcMar>
           </w:tcPr>
@@ -924,10 +1094,12 @@
             </w:pPr>
             <w:r>
               <w:rPr>
-                <w:rFonts w:ascii="Calibri" w:hAnsi="Calibri"/>
+                <w:rFonts w:ascii="Calibri" w:hAnsi="Calibri" w:eastAsia="ＭＳ 明朝" w:cs="Calibri" w:eastAsiaTheme="minorEastAsia" w:csTheme="minorBidi"/>
                 <w:b/>
+                <w:bCs/>
                 <w:color w:val="475569"/>
                 <w:sz w:val="17"/>
+                <w:szCs w:val="22"/>
               </w:rPr>
               <w:t>Juni 2019 – Desember 2019</w:t>
             </w:r>
@@ -939,12 +1111,14 @@
       <w:pPr>
         <w:pStyle w:val="ListBullet"/>
         <w:spacing w:before="20" w:after="40" w:line="276" w:lineRule="auto"/>
+        <w:ind w:left="360" w:hanging="360"/>
       </w:pPr>
       <w:r>
         <w:rPr>
-          <w:rFonts w:ascii="Calibri" w:hAnsi="Calibri"/>
+          <w:rFonts w:ascii="Calibri" w:hAnsi="Calibri" w:eastAsia="ＭＳ 明朝" w:cs="Calibri" w:eastAsiaTheme="minorEastAsia" w:csTheme="minorBidi"/>
           <w:color w:val="1E293B"/>
           <w:sz w:val="17"/>
+          <w:szCs w:val="22"/>
         </w:rPr>
         <w:t>Bertanggung jawab atas pengawasan operasional harian, keselamatan kerja, dan progres pergerakan unit alat berat di area proyek konstruksi.</w:t>
       </w:r>
@@ -953,12 +1127,14 @@
       <w:pPr>
         <w:pStyle w:val="ListBullet"/>
         <w:spacing w:before="20" w:after="40" w:line="276" w:lineRule="auto"/>
+        <w:ind w:left="360" w:hanging="360"/>
       </w:pPr>
       <w:r>
         <w:rPr>
-          <w:rFonts w:ascii="Calibri" w:hAnsi="Calibri"/>
+          <w:rFonts w:ascii="Calibri" w:hAnsi="Calibri" w:eastAsia="ＭＳ 明朝" w:cs="Calibri" w:eastAsiaTheme="minorEastAsia" w:csTheme="minorBidi"/>
           <w:color w:val="1E293B"/>
           <w:sz w:val="17"/>
+          <w:szCs w:val="22"/>
         </w:rPr>
         <w:t>Mengelola time sheet kerja operator, log konsumsi bahan bakar solar, serta rekapitulasi penggajian berbasis jam kerja operasional unit.</w:t>
       </w:r>
@@ -967,22 +1143,30 @@
       <w:pPr>
         <w:pStyle w:val="ListBullet"/>
         <w:spacing w:before="20" w:after="40" w:line="276" w:lineRule="auto"/>
+        <w:ind w:left="360" w:hanging="360"/>
       </w:pPr>
       <w:r>
         <w:rPr>
-          <w:rFonts w:ascii="Calibri" w:hAnsi="Calibri"/>
+          <w:rFonts w:ascii="Calibri" w:hAnsi="Calibri" w:eastAsia="ＭＳ 明朝" w:cs="Calibri" w:eastAsiaTheme="minorEastAsia" w:csTheme="minorBidi"/>
           <w:color w:val="1E293B"/>
           <w:sz w:val="17"/>
+          <w:szCs w:val="22"/>
         </w:rPr>
         <w:t>Menyusun laporan harian kondisi mesin dan jadwal pemeliharaan berkala guna meminimalkan downtime alat di lapangan.</w:t>
       </w:r>
     </w:p>
     <w:tbl>
       <w:tblPr>
-        <w:tblW w:type="auto" w:w="0"/>
+        <w:tblW w:w="0" w:type="auto"/>
         <w:jc w:val="center"/>
         <w:tblLayout w:type="fixed"/>
-        <w:tblLook w:firstColumn="1" w:firstRow="1" w:lastColumn="0" w:lastRow="0" w:noHBand="0" w:noVBand="1" w:val="04A0"/>
+        <w:tblCellMar>
+          <w:top w:w="0" w:type="dxa"/>
+          <w:left w:w="108" w:type="dxa"/>
+          <w:bottom w:w="0" w:type="dxa"/>
+          <w:right w:w="108" w:type="dxa"/>
+        </w:tblCellMar>
+        <w:tblLook w:firstRow="1" w:firstColumn="1" w:noVBand="1"/>
       </w:tblPr>
       <w:tblGrid>
         <w:gridCol w:w="5400"/>
@@ -991,11 +1175,11 @@
       <w:tr>
         <w:tc>
           <w:tcPr>
-            <w:tcW w:type="dxa" w:w="7920"/>
+            <w:tcW w:w="7920" w:type="dxa"/>
             <w:tcMar>
               <w:top w:w="30" w:type="dxa"/>
+              <w:left w:w="0" w:type="dxa"/>
               <w:bottom w:w="10" w:type="dxa"/>
-              <w:left w:w="0" w:type="dxa"/>
               <w:right w:w="0" w:type="dxa"/>
             </w:tcMar>
           </w:tcPr>
@@ -1006,29 +1190,37 @@
             </w:pPr>
             <w:r>
               <w:rPr>
-                <w:rFonts w:ascii="Calibri" w:hAnsi="Calibri"/>
+                <w:rFonts w:ascii="Calibri" w:hAnsi="Calibri" w:eastAsia="ＭＳ 明朝" w:cs="Calibri" w:eastAsiaTheme="minorEastAsia" w:csTheme="minorBidi"/>
                 <w:b/>
+                <w:bCs/>
                 <w:color w:val="0F172A"/>
                 <w:sz w:val="19"/>
+                <w:szCs w:val="22"/>
               </w:rPr>
               <w:t>Staff Research &amp; Development (R&amp;D)</w:t>
-              <w:br/>
+            </w:r>
+            <w:r>
+              <w:br w:type="textWrapping"/>
             </w:r>
             <w:r>
               <w:rPr>
-                <w:rFonts w:ascii="Calibri" w:hAnsi="Calibri"/>
+                <w:rFonts w:ascii="Calibri" w:hAnsi="Calibri" w:eastAsia="ＭＳ 明朝" w:cs="Calibri" w:eastAsiaTheme="minorEastAsia" w:csTheme="minorBidi"/>
                 <w:b/>
+                <w:bCs/>
                 <w:color w:val="0F172A"/>
                 <w:sz w:val="18"/>
+                <w:szCs w:val="22"/>
               </w:rPr>
               <w:t>PT. MACO GROUP</w:t>
             </w:r>
             <w:r>
               <w:rPr>
-                <w:rFonts w:ascii="Calibri" w:hAnsi="Calibri"/>
+                <w:rFonts w:ascii="Calibri" w:hAnsi="Calibri" w:eastAsia="ＭＳ 明朝" w:cs="Calibri" w:eastAsiaTheme="minorEastAsia" w:csTheme="minorBidi"/>
                 <w:i/>
+                <w:iCs/>
                 <w:color w:val="475569"/>
                 <w:sz w:val="17"/>
+                <w:szCs w:val="22"/>
               </w:rPr>
               <w:t xml:space="preserve"> | Bandung, Jawa Barat</w:t>
             </w:r>
@@ -1036,11 +1228,11 @@
         </w:tc>
         <w:tc>
           <w:tcPr>
-            <w:tcW w:type="dxa" w:w="2880"/>
+            <w:tcW w:w="2880" w:type="dxa"/>
             <w:tcMar>
               <w:top w:w="30" w:type="dxa"/>
+              <w:left w:w="0" w:type="dxa"/>
               <w:bottom w:w="10" w:type="dxa"/>
-              <w:left w:w="0" w:type="dxa"/>
               <w:right w:w="0" w:type="dxa"/>
             </w:tcMar>
           </w:tcPr>
@@ -1052,10 +1244,12 @@
             </w:pPr>
             <w:r>
               <w:rPr>
-                <w:rFonts w:ascii="Calibri" w:hAnsi="Calibri"/>
+                <w:rFonts w:ascii="Calibri" w:hAnsi="Calibri" w:eastAsia="ＭＳ 明朝" w:cs="Calibri" w:eastAsiaTheme="minorEastAsia" w:csTheme="minorBidi"/>
                 <w:b/>
+                <w:bCs/>
                 <w:color w:val="475569"/>
                 <w:sz w:val="17"/>
+                <w:szCs w:val="22"/>
               </w:rPr>
               <w:t>Januari 2019 – Agustus 2019</w:t>
             </w:r>
@@ -1067,12 +1261,14 @@
       <w:pPr>
         <w:pStyle w:val="ListBullet"/>
         <w:spacing w:before="20" w:after="40" w:line="276" w:lineRule="auto"/>
+        <w:ind w:left="360" w:hanging="360"/>
       </w:pPr>
       <w:r>
         <w:rPr>
-          <w:rFonts w:ascii="Calibri" w:hAnsi="Calibri"/>
+          <w:rFonts w:ascii="Calibri" w:hAnsi="Calibri" w:eastAsia="ＭＳ 明朝" w:cs="Calibri" w:eastAsiaTheme="minorEastAsia" w:csTheme="minorBidi"/>
           <w:color w:val="1E293B"/>
           <w:sz w:val="17"/>
+          <w:szCs w:val="22"/>
         </w:rPr>
         <w:t>Merancang prototipe antarmuka UI/UX website e-commerce Catenzo dan kanal digital produk Maco Group berdasarkan prinsip user experience dan kemudahan navigasi.</w:t>
       </w:r>
@@ -1081,22 +1277,30 @@
       <w:pPr>
         <w:pStyle w:val="ListBullet"/>
         <w:spacing w:before="20" w:after="40" w:line="276" w:lineRule="auto"/>
+        <w:ind w:left="360" w:hanging="360"/>
       </w:pPr>
       <w:r>
         <w:rPr>
-          <w:rFonts w:ascii="Calibri" w:hAnsi="Calibri"/>
+          <w:rFonts w:ascii="Calibri" w:hAnsi="Calibri" w:eastAsia="ＭＳ 明朝" w:cs="Calibri" w:eastAsiaTheme="minorEastAsia" w:csTheme="minorBidi"/>
           <w:color w:val="1E293B"/>
           <w:sz w:val="17"/>
+          <w:szCs w:val="22"/>
         </w:rPr>
         <w:t>Membuat konsep visual desain produk kreatif, materi promosi digital, dan visual publikasi media sosial.</w:t>
       </w:r>
     </w:p>
     <w:tbl>
       <w:tblPr>
-        <w:tblW w:type="auto" w:w="0"/>
+        <w:tblW w:w="0" w:type="auto"/>
         <w:jc w:val="center"/>
         <w:tblLayout w:type="fixed"/>
-        <w:tblLook w:firstColumn="1" w:firstRow="1" w:lastColumn="0" w:lastRow="0" w:noHBand="0" w:noVBand="1" w:val="04A0"/>
+        <w:tblCellMar>
+          <w:top w:w="0" w:type="dxa"/>
+          <w:left w:w="108" w:type="dxa"/>
+          <w:bottom w:w="0" w:type="dxa"/>
+          <w:right w:w="108" w:type="dxa"/>
+        </w:tblCellMar>
+        <w:tblLook w:firstRow="1" w:firstColumn="1" w:noVBand="1"/>
       </w:tblPr>
       <w:tblGrid>
         <w:gridCol w:w="5400"/>
@@ -1105,11 +1309,11 @@
       <w:tr>
         <w:tc>
           <w:tcPr>
-            <w:tcW w:type="dxa" w:w="7920"/>
+            <w:tcW w:w="7920" w:type="dxa"/>
             <w:tcMar>
               <w:top w:w="30" w:type="dxa"/>
+              <w:left w:w="0" w:type="dxa"/>
               <w:bottom w:w="10" w:type="dxa"/>
-              <w:left w:w="0" w:type="dxa"/>
               <w:right w:w="0" w:type="dxa"/>
             </w:tcMar>
           </w:tcPr>
@@ -1120,29 +1324,37 @@
             </w:pPr>
             <w:r>
               <w:rPr>
-                <w:rFonts w:ascii="Calibri" w:hAnsi="Calibri"/>
+                <w:rFonts w:ascii="Calibri" w:hAnsi="Calibri" w:eastAsia="ＭＳ 明朝" w:cs="Calibri" w:eastAsiaTheme="minorEastAsia" w:csTheme="minorBidi"/>
                 <w:b/>
+                <w:bCs/>
                 <w:color w:val="0F172A"/>
                 <w:sz w:val="19"/>
+                <w:szCs w:val="22"/>
               </w:rPr>
               <w:t>UX Researcher &amp; Graphic Designer / CRM Service Desk</w:t>
-              <w:br/>
+            </w:r>
+            <w:r>
+              <w:br w:type="textWrapping"/>
             </w:r>
             <w:r>
               <w:rPr>
-                <w:rFonts w:ascii="Calibri" w:hAnsi="Calibri"/>
+                <w:rFonts w:ascii="Calibri" w:hAnsi="Calibri" w:eastAsia="ＭＳ 明朝" w:cs="Calibri" w:eastAsiaTheme="minorEastAsia" w:csTheme="minorBidi"/>
                 <w:b/>
+                <w:bCs/>
                 <w:color w:val="0F172A"/>
                 <w:sz w:val="18"/>
+                <w:szCs w:val="22"/>
               </w:rPr>
               <w:t>PT. TELKOM INDONESIA / PT. INFOMEDIA SOLUSI HUMANIKA</w:t>
             </w:r>
             <w:r>
               <w:rPr>
-                <w:rFonts w:ascii="Calibri" w:hAnsi="Calibri"/>
+                <w:rFonts w:ascii="Calibri" w:hAnsi="Calibri" w:eastAsia="ＭＳ 明朝" w:cs="Calibri" w:eastAsiaTheme="minorEastAsia" w:csTheme="minorBidi"/>
                 <w:i/>
+                <w:iCs/>
                 <w:color w:val="475569"/>
                 <w:sz w:val="17"/>
+                <w:szCs w:val="22"/>
               </w:rPr>
               <w:t xml:space="preserve"> | Bandung, Jawa Barat</w:t>
             </w:r>
@@ -1150,11 +1362,11 @@
         </w:tc>
         <w:tc>
           <w:tcPr>
-            <w:tcW w:type="dxa" w:w="2880"/>
+            <w:tcW w:w="2880" w:type="dxa"/>
             <w:tcMar>
               <w:top w:w="30" w:type="dxa"/>
+              <w:left w:w="0" w:type="dxa"/>
               <w:bottom w:w="10" w:type="dxa"/>
-              <w:left w:w="0" w:type="dxa"/>
               <w:right w:w="0" w:type="dxa"/>
             </w:tcMar>
           </w:tcPr>
@@ -1166,10 +1378,12 @@
             </w:pPr>
             <w:r>
               <w:rPr>
-                <w:rFonts w:ascii="Calibri" w:hAnsi="Calibri"/>
+                <w:rFonts w:ascii="Calibri" w:hAnsi="Calibri" w:eastAsia="ＭＳ 明朝" w:cs="Calibri" w:eastAsiaTheme="minorEastAsia" w:csTheme="minorBidi"/>
                 <w:b/>
+                <w:bCs/>
                 <w:color w:val="475569"/>
                 <w:sz w:val="17"/>
+                <w:szCs w:val="22"/>
               </w:rPr>
               <w:t>April 2017 – Desember 2018</w:t>
             </w:r>
@@ -1181,12 +1395,14 @@
       <w:pPr>
         <w:pStyle w:val="ListBullet"/>
         <w:spacing w:before="20" w:after="40" w:line="276" w:lineRule="auto"/>
+        <w:ind w:left="360" w:hanging="360"/>
       </w:pPr>
       <w:r>
         <w:rPr>
-          <w:rFonts w:ascii="Calibri" w:hAnsi="Calibri"/>
+          <w:rFonts w:ascii="Calibri" w:hAnsi="Calibri" w:eastAsia="ＭＳ 明朝" w:cs="Calibri" w:eastAsiaTheme="minorEastAsia" w:csTheme="minorBidi"/>
           <w:color w:val="1E293B"/>
           <w:sz w:val="17"/>
+          <w:szCs w:val="22"/>
         </w:rPr>
         <w:t>Menganalisis antarmuka produk digital (web &amp; mobile) internal Telkom dengan metode heuristic evaluation dan usability testing.</w:t>
       </w:r>
@@ -1195,12 +1411,14 @@
       <w:pPr>
         <w:pStyle w:val="ListBullet"/>
         <w:spacing w:before="20" w:after="40" w:line="276" w:lineRule="auto"/>
+        <w:ind w:left="360" w:hanging="360"/>
       </w:pPr>
       <w:r>
         <w:rPr>
-          <w:rFonts w:ascii="Calibri" w:hAnsi="Calibri"/>
+          <w:rFonts w:ascii="Calibri" w:hAnsi="Calibri" w:eastAsia="ＭＳ 明朝" w:cs="Calibri" w:eastAsiaTheme="minorEastAsia" w:csTheme="minorBidi"/>
           <w:color w:val="1E293B"/>
           <w:sz w:val="17"/>
+          <w:szCs w:val="22"/>
         </w:rPr>
         <w:t>Menyusun alur pengguna (user flow), arsitektur informasi (IA), dan wireframe prototipe untuk kolaborasi bersama tim developer.</w:t>
       </w:r>
@@ -1209,12 +1427,14 @@
       <w:pPr>
         <w:pStyle w:val="ListBullet"/>
         <w:spacing w:before="20" w:after="40" w:line="276" w:lineRule="auto"/>
+        <w:ind w:left="360" w:hanging="360"/>
       </w:pPr>
       <w:r>
         <w:rPr>
-          <w:rFonts w:ascii="Calibri" w:hAnsi="Calibri"/>
+          <w:rFonts w:ascii="Calibri" w:hAnsi="Calibri" w:eastAsia="ＭＳ 明朝" w:cs="Calibri" w:eastAsiaTheme="minorEastAsia" w:csTheme="minorBidi"/>
           <w:color w:val="1E293B"/>
           <w:sz w:val="17"/>
+          <w:szCs w:val="22"/>
         </w:rPr>
         <w:t>Mengolah hasil masukan pengujian pengguna (user feedback) menjadi dokumen rekomendasi perbaikan desain antarmuka.</w:t>
       </w:r>
@@ -1223,12 +1443,14 @@
       <w:pPr>
         <w:pStyle w:val="ListBullet"/>
         <w:spacing w:before="20" w:after="40" w:line="276" w:lineRule="auto"/>
+        <w:ind w:left="360" w:hanging="360"/>
       </w:pPr>
       <w:r>
         <w:rPr>
-          <w:rFonts w:ascii="Calibri" w:hAnsi="Calibri"/>
+          <w:rFonts w:ascii="Calibri" w:hAnsi="Calibri" w:eastAsia="ＭＳ 明朝" w:cs="Calibri" w:eastAsiaTheme="minorEastAsia" w:csTheme="minorBidi"/>
           <w:color w:val="1E293B"/>
           <w:sz w:val="17"/>
+          <w:szCs w:val="22"/>
         </w:rPr>
         <w:t>Menangani tiket eskalasi dan layanan CRM pada unit HCC DDS ISH Bandung dengan standar penyelesaian tepat waktu.</w:t>
       </w:r>
@@ -1236,27 +1458,35 @@
     <w:p>
       <w:pPr>
         <w:keepNext/>
-        <w:spacing w:before="180" w:after="40"/>
         <w:pBdr>
           <w:bottom w:val="single" w:sz="6" w:space="2" w:color="0284C7"/>
         </w:pBdr>
+        <w:spacing w:before="180" w:after="40"/>
       </w:pPr>
       <w:r>
         <w:rPr>
-          <w:rFonts w:ascii="Calibri" w:hAnsi="Calibri"/>
+          <w:rFonts w:ascii="Calibri" w:hAnsi="Calibri" w:eastAsia="ＭＳ 明朝" w:cs="Calibri" w:eastAsiaTheme="minorEastAsia" w:csTheme="minorBidi"/>
           <w:b/>
+          <w:bCs/>
           <w:color w:val="0F172A"/>
           <w:sz w:val="22"/>
+          <w:szCs w:val="22"/>
         </w:rPr>
         <w:t>PENDIDIKAN FORMAL</w:t>
       </w:r>
     </w:p>
     <w:tbl>
       <w:tblPr>
-        <w:tblW w:type="auto" w:w="0"/>
+        <w:tblW w:w="0" w:type="auto"/>
         <w:jc w:val="center"/>
         <w:tblLayout w:type="fixed"/>
-        <w:tblLook w:firstColumn="1" w:firstRow="1" w:lastColumn="0" w:lastRow="0" w:noHBand="0" w:noVBand="1" w:val="04A0"/>
+        <w:tblCellMar>
+          <w:top w:w="0" w:type="dxa"/>
+          <w:left w:w="108" w:type="dxa"/>
+          <w:bottom w:w="0" w:type="dxa"/>
+          <w:right w:w="108" w:type="dxa"/>
+        </w:tblCellMar>
+        <w:tblLook w:firstRow="1" w:firstColumn="1" w:noVBand="1"/>
       </w:tblPr>
       <w:tblGrid>
         <w:gridCol w:w="5400"/>
@@ -1265,7 +1495,13 @@
       <w:tr>
         <w:tc>
           <w:tcPr>
-            <w:tcW w:type="dxa" w:w="8352"/>
+            <w:tcW w:w="8352" w:type="dxa"/>
+            <w:tcMar>
+              <w:top w:w="0" w:type="dxa"/>
+              <w:left w:w="108" w:type="dxa"/>
+              <w:bottom w:w="0" w:type="dxa"/>
+              <w:right w:w="108" w:type="dxa"/>
+            </w:tcMar>
           </w:tcPr>
           <w:p>
             <w:pPr>
@@ -1273,30 +1509,54 @@
             </w:pPr>
             <w:r>
               <w:rPr>
-                <w:rFonts w:ascii="Calibri" w:hAnsi="Calibri"/>
+                <w:rFonts w:ascii="Calibri" w:hAnsi="Calibri" w:eastAsia="ＭＳ 明朝" w:cs="Calibri" w:eastAsiaTheme="minorEastAsia" w:csTheme="minorBidi"/>
                 <w:b/>
+                <w:bCs/>
                 <w:color w:val="0F172A"/>
                 <w:sz w:val="18"/>
+                <w:szCs w:val="22"/>
               </w:rPr>
               <w:t>STMIK "AMIKBANDUNG" — Sarjana Komputer (S.Kom.), Teknik Informatika</w:t>
-              <w:br/>
+            </w:r>
+            <w:r>
+              <w:br w:type="textWrapping"/>
             </w:r>
             <w:r>
               <w:rPr>
-                <w:rFonts w:ascii="Calibri" w:hAnsi="Calibri"/>
+                <w:rFonts w:ascii="Calibri" w:hAnsi="Calibri" w:eastAsia="ＭＳ 明朝" w:cs="Calibri" w:eastAsiaTheme="minorEastAsia" w:csTheme="minorBidi"/>
                 <w:i/>
+                <w:iCs/>
                 <w:color w:val="475569"/>
                 <w:sz w:val="17"/>
+                <w:szCs w:val="22"/>
               </w:rPr>
               <w:t>Status: Terakreditasi B (BAN-PT) | IPK: 2.79 / 4.00 (145 SKS)</w:t>
-              <w:br/>
+            </w:r>
+            <w:r>
+              <w:br w:type="textWrapping"/>
+            </w:r>
+            <w:r>
+              <w:rPr>
+                <w:rFonts w:ascii="Calibri" w:hAnsi="Calibri" w:eastAsia="ＭＳ 明朝" w:cs="Calibri" w:eastAsiaTheme="minorEastAsia" w:csTheme="minorBidi"/>
+                <w:i/>
+                <w:iCs/>
+                <w:color w:val="475569"/>
+                <w:sz w:val="17"/>
+                <w:szCs w:val="22"/>
+              </w:rPr>
               <w:t>Skripsi: Perancangan dan Implementasi Aplikasi Guitar Guide Sebagai Media Pembelajaran Untuk Grade Pertama Kursus Gitar Berbasis Mobile</w:t>
             </w:r>
           </w:p>
         </w:tc>
         <w:tc>
           <w:tcPr>
-            <w:tcW w:type="dxa" w:w="2448"/>
+            <w:tcW w:w="2448" w:type="dxa"/>
+            <w:tcMar>
+              <w:top w:w="0" w:type="dxa"/>
+              <w:left w:w="108" w:type="dxa"/>
+              <w:bottom w:w="0" w:type="dxa"/>
+              <w:right w:w="108" w:type="dxa"/>
+            </w:tcMar>
           </w:tcPr>
           <w:p>
             <w:pPr>
@@ -1304,13 +1564,27 @@
             </w:pPr>
             <w:r>
               <w:rPr>
-                <w:rFonts w:ascii="Calibri" w:hAnsi="Calibri"/>
+                <w:rFonts w:ascii="Calibri" w:hAnsi="Calibri" w:eastAsia="ＭＳ 明朝" w:cs="Calibri" w:eastAsiaTheme="minorEastAsia" w:csTheme="minorBidi"/>
                 <w:b/>
+                <w:bCs/>
                 <w:color w:val="475569"/>
                 <w:sz w:val="17"/>
+                <w:szCs w:val="22"/>
               </w:rPr>
               <w:t>2011 – 2015</w:t>
-              <w:br/>
+            </w:r>
+            <w:r>
+              <w:br w:type="textWrapping"/>
+            </w:r>
+            <w:r>
+              <w:rPr>
+                <w:rFonts w:ascii="Calibri" w:hAnsi="Calibri" w:eastAsia="ＭＳ 明朝" w:cs="Calibri" w:eastAsiaTheme="minorEastAsia" w:csTheme="minorBidi"/>
+                <w:b/>
+                <w:bCs/>
+                <w:color w:val="475569"/>
+                <w:sz w:val="17"/>
+                <w:szCs w:val="22"/>
+              </w:rPr>
               <w:t>Bandung, Jawa Barat</w:t>
             </w:r>
           </w:p>
@@ -1319,7 +1593,13 @@
       <w:tr>
         <w:tc>
           <w:tcPr>
-            <w:tcW w:type="dxa" w:w="8352"/>
+            <w:tcW w:w="8352" w:type="dxa"/>
+            <w:tcMar>
+              <w:top w:w="0" w:type="dxa"/>
+              <w:left w:w="108" w:type="dxa"/>
+              <w:bottom w:w="0" w:type="dxa"/>
+              <w:right w:w="108" w:type="dxa"/>
+            </w:tcMar>
           </w:tcPr>
           <w:p>
             <w:pPr>
@@ -1327,10 +1607,12 @@
             </w:pPr>
             <w:r>
               <w:rPr>
-                <w:rFonts w:ascii="Calibri" w:hAnsi="Calibri"/>
+                <w:rFonts w:ascii="Calibri" w:hAnsi="Calibri" w:eastAsia="ＭＳ 明朝" w:cs="Calibri" w:eastAsiaTheme="minorEastAsia" w:csTheme="minorBidi"/>
                 <w:b/>
+                <w:bCs/>
                 <w:color w:val="0F172A"/>
                 <w:sz w:val="18"/>
+                <w:szCs w:val="22"/>
               </w:rPr>
               <w:t>SMA NEGERI 3 GARUT — Jurusan Ilmu Pengetahuan Alam (IPA)</w:t>
             </w:r>
@@ -1338,7 +1620,13 @@
         </w:tc>
         <w:tc>
           <w:tcPr>
-            <w:tcW w:type="dxa" w:w="2448"/>
+            <w:tcW w:w="2448" w:type="dxa"/>
+            <w:tcMar>
+              <w:top w:w="0" w:type="dxa"/>
+              <w:left w:w="108" w:type="dxa"/>
+              <w:bottom w:w="0" w:type="dxa"/>
+              <w:right w:w="108" w:type="dxa"/>
+            </w:tcMar>
           </w:tcPr>
           <w:p>
             <w:pPr>
@@ -1347,13 +1635,27 @@
             </w:pPr>
             <w:r>
               <w:rPr>
-                <w:rFonts w:ascii="Calibri" w:hAnsi="Calibri"/>
+                <w:rFonts w:ascii="Calibri" w:hAnsi="Calibri" w:eastAsia="ＭＳ 明朝" w:cs="Calibri" w:eastAsiaTheme="minorEastAsia" w:csTheme="minorBidi"/>
                 <w:b/>
+                <w:bCs/>
                 <w:color w:val="475569"/>
                 <w:sz w:val="17"/>
+                <w:szCs w:val="22"/>
               </w:rPr>
               <w:t>2007 – 2010</w:t>
-              <w:br/>
+            </w:r>
+            <w:r>
+              <w:br w:type="textWrapping"/>
+            </w:r>
+            <w:r>
+              <w:rPr>
+                <w:rFonts w:ascii="Calibri" w:hAnsi="Calibri" w:eastAsia="ＭＳ 明朝" w:cs="Calibri" w:eastAsiaTheme="minorEastAsia" w:csTheme="minorBidi"/>
+                <w:b/>
+                <w:bCs/>
+                <w:color w:val="475569"/>
+                <w:sz w:val="17"/>
+                <w:szCs w:val="22"/>
+              </w:rPr>
               <w:t>Garut, Jawa Barat</w:t>
             </w:r>
           </w:p>
@@ -1363,17 +1665,19 @@
     <w:p>
       <w:pPr>
         <w:keepNext/>
-        <w:spacing w:before="180" w:after="40"/>
         <w:pBdr>
           <w:bottom w:val="single" w:sz="6" w:space="2" w:color="0284C7"/>
         </w:pBdr>
+        <w:spacing w:before="180" w:after="40"/>
       </w:pPr>
       <w:r>
         <w:rPr>
-          <w:rFonts w:ascii="Calibri" w:hAnsi="Calibri"/>
+          <w:rFonts w:ascii="Calibri" w:hAnsi="Calibri" w:eastAsia="ＭＳ 明朝" w:cs="Calibri" w:eastAsiaTheme="minorEastAsia" w:csTheme="minorBidi"/>
           <w:b/>
+          <w:bCs/>
           <w:color w:val="0F172A"/>
           <w:sz w:val="22"/>
+          <w:szCs w:val="22"/>
         </w:rPr>
         <w:t>SERTIFIKASI RESMI &amp; PELATIHAN PROFESIONAL</w:t>
       </w:r>
@@ -1382,12 +1686,14 @@
       <w:pPr>
         <w:pStyle w:val="ListBullet"/>
         <w:spacing w:before="20" w:after="40"/>
+        <w:ind w:left="360" w:hanging="360"/>
       </w:pPr>
       <w:r>
         <w:rPr>
-          <w:rFonts w:ascii="Calibri" w:hAnsi="Calibri"/>
+          <w:rFonts w:ascii="Calibri" w:hAnsi="Calibri" w:eastAsia="ＭＳ 明朝" w:cs="Calibri" w:eastAsiaTheme="minorEastAsia" w:csTheme="minorBidi"/>
           <w:color w:val="1E293B"/>
           <w:sz w:val="17"/>
+          <w:szCs w:val="22"/>
         </w:rPr>
         <w:t>Sertifikasi Kompetensi BNSP — Pengawas Operasional Pertama (POP) | LSP Energi Mandiri | No. Sertifikat: 05100 3121 4 0035925 2025 | Masa Berlaku: Mei 2025 – 26 Mei 2030</w:t>
       </w:r>
@@ -1396,12 +1702,14 @@
       <w:pPr>
         <w:pStyle w:val="ListBullet"/>
         <w:spacing w:before="20" w:after="40"/>
+        <w:ind w:left="360" w:hanging="360"/>
       </w:pPr>
       <w:r>
         <w:rPr>
-          <w:rFonts w:ascii="Calibri" w:hAnsi="Calibri"/>
+          <w:rFonts w:ascii="Calibri" w:hAnsi="Calibri" w:eastAsia="ＭＳ 明朝" w:cs="Calibri" w:eastAsiaTheme="minorEastAsia" w:csTheme="minorBidi"/>
           <w:color w:val="1E293B"/>
           <w:sz w:val="17"/>
+          <w:szCs w:val="22"/>
         </w:rPr>
         <w:t>Pelatihan Profesional UI/UX &amp; Usability Research — Komunitas UX.ID Bandung (03 Mei 2018)</w:t>
       </w:r>
@@ -1410,12 +1718,14 @@
       <w:pPr>
         <w:pStyle w:val="ListBullet"/>
         <w:spacing w:before="20" w:after="40"/>
+        <w:ind w:left="360" w:hanging="360"/>
       </w:pPr>
       <w:r>
         <w:rPr>
-          <w:rFonts w:ascii="Calibri" w:hAnsi="Calibri"/>
+          <w:rFonts w:ascii="Calibri" w:hAnsi="Calibri" w:eastAsia="ＭＳ 明朝" w:cs="Calibri" w:eastAsiaTheme="minorEastAsia" w:csTheme="minorBidi"/>
           <w:color w:val="1E293B"/>
           <w:sz w:val="17"/>
+          <w:szCs w:val="22"/>
         </w:rPr>
         <w:t>Pelatihan Character Building &amp; Kepemimpinan — STMIK AMIKBANDUNG (21 Maret 2015)</w:t>
       </w:r>
@@ -1423,17 +1733,19 @@
     <w:p>
       <w:pPr>
         <w:keepNext/>
-        <w:spacing w:before="180" w:after="40"/>
         <w:pBdr>
           <w:bottom w:val="single" w:sz="6" w:space="2" w:color="0284C7"/>
         </w:pBdr>
+        <w:spacing w:before="180" w:after="40"/>
       </w:pPr>
       <w:r>
         <w:rPr>
-          <w:rFonts w:ascii="Calibri" w:hAnsi="Calibri"/>
+          <w:rFonts w:ascii="Calibri" w:hAnsi="Calibri" w:eastAsia="ＭＳ 明朝" w:cs="Calibri" w:eastAsiaTheme="minorEastAsia" w:csTheme="minorBidi"/>
           <w:b/>
+          <w:bCs/>
           <w:color w:val="0F172A"/>
           <w:sz w:val="22"/>
+          <w:szCs w:val="22"/>
         </w:rPr>
         <w:t>PORTOFOLIO TERPILIH &amp; VERIFIKASI KARYA</w:t>
       </w:r>
@@ -1444,16 +1756,20 @@
       </w:pPr>
       <w:r>
         <w:rPr>
-          <w:rFonts w:ascii="Calibri" w:hAnsi="Calibri"/>
+          <w:rFonts w:ascii="Calibri" w:hAnsi="Calibri" w:eastAsia="ＭＳ 明朝" w:cs="Calibri" w:eastAsiaTheme="minorEastAsia" w:csTheme="minorBidi"/>
           <w:color w:val="1E293B"/>
           <w:sz w:val="17"/>
+          <w:szCs w:val="22"/>
         </w:rPr>
         <w:t xml:space="preserve">Portofolio lengkap dan visualisasi sistem operasional dapat diakses secara interaktif pada website portofolio: </w:t>
       </w:r>
       <w:hyperlink r:id="rId10">
         <w:r>
           <w:rPr>
+            <w:rFonts w:ascii="Cambria" w:hAnsi="Cambria" w:eastAsia="ＭＳ 明朝" w:cs="Cambria" w:asciiTheme="minorHAnsi" w:hAnsiTheme="minorHAnsi" w:eastAsiaTheme="minorEastAsia" w:csTheme="minorBidi"/>
             <w:color w:val="0284C7"/>
+            <w:sz w:val="22"/>
+            <w:szCs w:val="22"/>
             <w:u w:val="single"/>
           </w:rPr>
           <w:t>https://riodarma002.github.io/web_porto_rio_darma/</w:t>
@@ -1464,12 +1780,14 @@
       <w:pPr>
         <w:pStyle w:val="ListBullet"/>
         <w:spacing w:before="20" w:after="40"/>
+        <w:ind w:left="360" w:hanging="360"/>
       </w:pPr>
       <w:r>
         <w:rPr>
-          <w:rFonts w:ascii="Calibri" w:hAnsi="Calibri"/>
+          <w:rFonts w:ascii="Calibri" w:hAnsi="Calibri" w:eastAsia="ＭＳ 明朝" w:cs="Calibri" w:eastAsiaTheme="minorEastAsia" w:csTheme="minorBidi"/>
           <w:color w:val="1E293B"/>
           <w:sz w:val="17"/>
+          <w:szCs w:val="22"/>
         </w:rPr>
         <w:t>Fleet Management System (FMS) &amp; Geofencing: Solusi desktop dan virtual geofence untuk pelacakan koordinat dan efisiensi mobilitas armada secara real-time.</w:t>
       </w:r>
@@ -1478,12 +1796,14 @@
       <w:pPr>
         <w:pStyle w:val="ListBullet"/>
         <w:spacing w:before="20" w:after="40"/>
+        <w:ind w:left="360" w:hanging="360"/>
       </w:pPr>
       <w:r>
         <w:rPr>
-          <w:rFonts w:ascii="Calibri" w:hAnsi="Calibri"/>
+          <w:rFonts w:ascii="Calibri" w:hAnsi="Calibri" w:eastAsia="ＭＳ 明朝" w:cs="Calibri" w:eastAsiaTheme="minorEastAsia" w:csTheme="minorBidi"/>
           <w:color w:val="1E293B"/>
           <w:sz w:val="17"/>
+          <w:szCs w:val="22"/>
         </w:rPr>
         <w:t>Dashboard Web Optrack &amp; Produksi: Sistem visualisasi performa armada dan evaluasi target produksi tambang (planning.mge.co.id).</w:t>
       </w:r>
@@ -1492,12 +1812,14 @@
       <w:pPr>
         <w:pStyle w:val="ListBullet"/>
         <w:spacing w:before="20" w:after="40"/>
+        <w:ind w:left="360" w:hanging="360"/>
       </w:pPr>
       <w:r>
         <w:rPr>
-          <w:rFonts w:ascii="Calibri" w:hAnsi="Calibri"/>
+          <w:rFonts w:ascii="Calibri" w:hAnsi="Calibri" w:eastAsia="ＭＳ 明朝" w:cs="Calibri" w:eastAsiaTheme="minorEastAsia" w:csTheme="minorBidi"/>
           <w:color w:val="1E293B"/>
           <w:sz w:val="17"/>
+          <w:szCs w:val="22"/>
         </w:rPr>
         <w:t>Digitalisasi Spasial ArcGIS &amp; MAXIMO PLN: Pemodelan jaringan distribusi Gardu CBTG U, SUTM, JTR, dan konversi data tabular ke enterprise MAXIMO.</w:t>
       </w:r>
@@ -1506,12 +1828,14 @@
       <w:pPr>
         <w:pStyle w:val="ListBullet"/>
         <w:spacing w:before="20" w:after="40"/>
+        <w:ind w:left="360" w:hanging="360"/>
       </w:pPr>
       <w:r>
         <w:rPr>
-          <w:rFonts w:ascii="Calibri" w:hAnsi="Calibri"/>
+          <w:rFonts w:ascii="Calibri" w:hAnsi="Calibri" w:eastAsia="ＭＳ 明朝" w:cs="Calibri" w:eastAsiaTheme="minorEastAsia" w:csTheme="minorBidi"/>
           <w:color w:val="1E293B"/>
           <w:sz w:val="17"/>
+          <w:szCs w:val="22"/>
         </w:rPr>
         <w:t>Dashboard Business Intelligence Power BI: Pemantauan unit commissioning, distribusi logistik bahan bakar Fueltruck, dan efisiensi operasional.</w:t>
       </w:r>
@@ -1519,17 +1843,19 @@
     <w:p>
       <w:pPr>
         <w:keepNext/>
-        <w:spacing w:before="180" w:after="40"/>
         <w:pBdr>
           <w:bottom w:val="single" w:sz="6" w:space="2" w:color="0284C7"/>
         </w:pBdr>
+        <w:spacing w:before="180" w:after="40"/>
       </w:pPr>
       <w:r>
         <w:rPr>
-          <w:rFonts w:ascii="Calibri" w:hAnsi="Calibri"/>
+          <w:rFonts w:ascii="Calibri" w:hAnsi="Calibri" w:eastAsia="ＭＳ 明朝" w:cs="Calibri" w:eastAsiaTheme="minorEastAsia" w:csTheme="minorBidi"/>
           <w:b/>
+          <w:bCs/>
           <w:color w:val="0F172A"/>
           <w:sz w:val="22"/>
+          <w:szCs w:val="22"/>
         </w:rPr>
         <w:t>REFERENSI PROFESIONAL</w:t>
       </w:r>
@@ -1540,16 +1866,20 @@
       </w:pPr>
       <w:r>
         <w:rPr>
-          <w:rFonts w:ascii="Calibri" w:hAnsi="Calibri"/>
+          <w:rFonts w:ascii="Calibri" w:hAnsi="Calibri" w:eastAsia="ＭＳ 明朝" w:cs="Calibri" w:eastAsiaTheme="minorEastAsia" w:csTheme="minorBidi"/>
           <w:color w:val="1E293B"/>
           <w:sz w:val="17"/>
+          <w:szCs w:val="22"/>
         </w:rPr>
         <w:t xml:space="preserve">Gilan Khusnul — Drafter GIS, PT. Quadran Inovasi Karya Bersama | Telepon: +62 859-4670-6123 | Email: </w:t>
       </w:r>
       <w:hyperlink r:id="rId15">
         <w:r>
           <w:rPr>
+            <w:rFonts w:ascii="Cambria" w:hAnsi="Cambria" w:eastAsia="ＭＳ 明朝" w:cs="Cambria" w:asciiTheme="minorHAnsi" w:hAnsiTheme="minorHAnsi" w:eastAsiaTheme="minorEastAsia" w:csTheme="minorBidi"/>
             <w:color w:val="0284C7"/>
+            <w:sz w:val="22"/>
+            <w:szCs w:val="22"/>
             <w:u w:val="single"/>
           </w:rPr>
           <w:t>gilankhusnul022@gmail.com</w:t>
@@ -1559,7 +1889,6 @@
     <w:sectPr>
       <w:pgSz w:w="12240" w:h="15840"/>
       <w:pgMar w:top="720" w:right="720" w:bottom="720" w:left="720" w:header="720" w:footer="720" w:gutter="0"/>
-      <w:cols w:space="720"/>
       <w:docGrid w:linePitch="360"/>
     </w:sectPr>
   </w:body>

</xml_diff>